<commit_message>
Limpieza para entrega final y README actualizado
</commit_message>
<xml_diff>
--- a/entregables/informe_final_SIMtec.docx
+++ b/entregables/informe_final_SIMtec.docx
@@ -2357,7 +2357,7 @@
                 <w:noProof/>
                 <w:webHidden/>
               </w:rPr>
-              <w:t>9</w:t>
+              <w:t>8</w:t>
             </w:r>
             <w:r>
               <w:rPr>
@@ -2659,7 +2659,7 @@
                 <w:noProof/>
                 <w:webHidden/>
               </w:rPr>
-              <w:t>10</w:t>
+              <w:t>9</w:t>
             </w:r>
             <w:r>
               <w:rPr>
@@ -2764,7 +2764,7 @@
                 <w:noProof/>
                 <w:webHidden/>
               </w:rPr>
-              <w:t>11</w:t>
+              <w:t>10</w:t>
             </w:r>
             <w:r>
               <w:rPr>
@@ -3383,7 +3383,7 @@
           <w:sz w:val="20"/>
           <w:szCs w:val="20"/>
         </w:rPr>
-        <w:t>Desafío 1 — Data-Driven Repurchase based on Service Retention: predicción de retorno a la red oficial en ventana de servicio.</w:t>
+        <w:t xml:space="preserve">Desafío 1: Data-Driven Repurchase based on Service Retention.</w:t>
       </w:r>
       <w:r>
         <w:rPr>
@@ -3392,7 +3392,7 @@
           <w:sz w:val="20"/>
           <w:szCs w:val="20"/>
         </w:rPr>
-        <w:t xml:space="preserve"> Área: Customer Experience &amp; Data Strategy, Posventa / Retención de Servicio. Mentor y SPOC: Facundo Bertolosso.</w:t>
+        <w:t xml:space="preserve"> Predicción de retorno a la red oficial en ventana de servicio. Área: Customer Experience &amp; Data Strategy, Posventa / Retención de Servicio. Mentor y SPOC: Facundo Bertolosso.</w:t>
       </w:r>
     </w:p>
     <w:p>
@@ -3409,7 +3409,7 @@
           <w:sz w:val="20"/>
           <w:szCs w:val="20"/>
         </w:rPr>
-        <w:t>Ford quiere construir relaciones que duren toda la vida del cliente, y la posventa es donde una compra se convierte en lealtad. Hoy, cuando una Ranger entra en su ventana de mantenimiento, los concesionarios la contactan con reglas de tiempo, kilometraje y vencimiento que dicen quién es elegible, pero no quién está en riesgo. Dos clientes reciben el mismo mensaje aunque uno vaya a volver solo y el otro esté por irse, y el que se va se detecta cuando la ventana ya cerró.</w:t>
+        <w:t xml:space="preserve">Cuando una Ranger entra en su ventana de mantenimiento, el concesionario decide a quién contactar con reglas de tiempo, kilometraje y vencimiento. Esas reglas dicen quién está en condiciones de hacer el service, pero no quién está por dejar de hacerlo en la red. El cliente que va a volver por su cuenta y el que se está yendo reciben el mismo mensaje, y la pérdida del segundo recién se nota cuando su ventana ya cerró. Para Ford, que busca sostener la relación durante toda la vida del cliente, la posventa es el lugar donde eso se juega.</w:t>
       </w:r>
     </w:p>
     <w:p>
@@ -3437,7 +3437,7 @@
           <w:sz w:val="20"/>
           <w:szCs w:val="20"/>
         </w:rPr>
-        <w:t>para cada usuario con al menos un vehículo dentro de la ventana de servicio, estime la probabilidad de churn</w:t>
+        <w:t xml:space="preserve">para cada usuario con al menos un vehículo dentro de la ventana de servicio</w:t>
       </w:r>
       <w:r>
         <w:rPr>
@@ -3446,7 +3446,7 @@
           <w:sz w:val="20"/>
           <w:szCs w:val="20"/>
         </w:rPr>
-        <w:t xml:space="preserve">, definida como </w:t>
+        <w:t xml:space="preserve">, estime la probabilidad de churn, entendido como </w:t>
       </w:r>
       <w:r>
         <w:rPr>
@@ -3457,7 +3457,7 @@
           <w:sz w:val="20"/>
           <w:szCs w:val="20"/>
         </w:rPr>
-        <w:t>no completar el próximo mantenimiento programado en la red oficial dentro del horizonte definido por negocio</w:t>
+        <w:t xml:space="preserve">no completar el próximo mantenimiento programado en la red oficial</w:t>
       </w:r>
       <w:r>
         <w:rPr>
@@ -3466,7 +3466,7 @@
           <w:sz w:val="20"/>
           <w:szCs w:val="20"/>
         </w:rPr>
-        <w:t>. La unidad es usuario–vehículo (VIN)–ventana, con una vista consolidada por usuario cuando tiene varios vehículos.</w:t>
+        <w:t xml:space="preserve"> dentro del horizonte que defina el negocio. La unidad de análisis es usuario–vehículo (VIN)–ventana, y cuando un usuario tiene varios vehículos se pide además una vista consolidada.</w:t>
       </w:r>
     </w:p>
     <w:p>
@@ -3483,16 +3483,7 @@
           <w:sz w:val="20"/>
           <w:szCs w:val="20"/>
         </w:rPr>
-        <w:t>El resultado mínimo que pide es, por vehículo: customer_id y vehicle_id seudonimizados, fecha de scoring</w:t>
-      </w:r>
-      <w:r>
-        <w:rPr>
-          <w:i w:val="0"/>
-          <w:iCs w:val="0"/>
-          <w:sz w:val="20"/>
-          <w:szCs w:val="20"/>
-        </w:rPr>
-        <w:t>, probabilidad entre 0 y 1, segmento de riesgo y principales drivers. Las restricciones son cinco: ninguna variable posterior a la fecha de scoring puede usarse, la validación se separa por fecha, las probabilidades se calibran, la explicación es auditable y todo es reproducible.</w:t>
+        <w:t xml:space="preserve">La salida mínima, por vehículo, incluye customer_id y vehicle_id seudonimizados, fecha de scoring, probabilidad entre 0 y 1, segmento de riesgo y principales drivers. Hay cinco restricciones: no usar ninguna variable posterior a la fecha de scoring, validar con separación por fecha, calibrar las probabilidades, que la explicación sea auditable y que todo pueda reproducirse.</w:t>
       </w:r>
     </w:p>
     <w:p>
@@ -3706,7 +3697,7 @@
           <w:sz w:val="20"/>
           <w:szCs w:val="20"/>
         </w:rPr>
-        <w:t>Datos recibidos.</w:t>
+        <w:t xml:space="preserve">Datos recibidos.</w:t>
       </w:r>
       <w:r>
         <w:rPr>
@@ -3715,7 +3706,7 @@
           <w:sz w:val="20"/>
           <w:szCs w:val="20"/>
         </w:rPr>
-        <w:t xml:space="preserve"> Dos extractos seudonimizados de BigQuery: las ventas de Ranger en Argentina y la agenda de turnos de servicio de todo el parque Ranger, ambos de 2024 a 2026, con corte el 25/08/2026. No hay CRM, DMS, campañas, web ni telemetría. Los volúmenes están en el Anexo A.</w:t>
+        <w:t xml:space="preserve"> Dos extractos seudonimizados de BigQuery: las ventas de Ranger en Argentina y la agenda de turnos de servicio de todo el parque Ranger, ambos de 2024 a 2026 y con corte el 25/08/2026. No incluyen CRM, DMS, campañas, web ni telemetría. Los volúmenes están en el Anexo A.</w:t>
       </w:r>
     </w:p>
     <w:p>
@@ -3732,16 +3723,7 @@
           <w:sz w:val="20"/>
           <w:szCs w:val="20"/>
         </w:rPr>
-        <w:t>Una nota sobre el título: el resumen público habla de "Repurchase Propensity</w:t>
-      </w:r>
-      <w:r>
-        <w:rPr>
-          <w:i w:val="0"/>
-          <w:iCs w:val="0"/>
-          <w:sz w:val="20"/>
-          <w:szCs w:val="20"/>
-        </w:rPr>
-        <w:t>", y la ficha técnica lo precisa como retención de service, porque el service es el punto de contacto que sostiene la recompra. El dataset no trae una variable de recompra, pero sí permite observarla, y la usamos como evidencia complementaria (sección 2.2.8).</w:t>
+        <w:t xml:space="preserve">Sobre el título: el resumen público del desafío habla de "Repurchase Propensity" y la ficha técnica lo baja a retención de service, porque el service es el contacto que mantiene abierta la posibilidad de una recompra. El dataset no trae una variable de recompra, aunque permite observarla; la usamos como evidencia complementaria (sección 2.2.8).</w:t>
       </w:r>
     </w:p>
     <w:p>
@@ -3914,7 +3896,7 @@
           <w:sz w:val="20"/>
           <w:szCs w:val="20"/>
         </w:rPr>
-        <w:t>El problema.</w:t>
+        <w:t xml:space="preserve">El problema.</w:t>
       </w:r>
       <w:r>
         <w:rPr>
@@ -3923,16 +3905,7 @@
           <w:sz w:val="20"/>
           <w:szCs w:val="20"/>
         </w:rPr>
-        <w:t xml:space="preserve"> Cada mes, entre 6.000 y 7.000 Ranger entran en su ventana de mantenimiento, y cuatro de cada diez no hacen el service</w:t>
-      </w:r>
-      <w:r>
-        <w:rPr>
-          <w:i w:val="0"/>
-          <w:iCs w:val="0"/>
-          <w:sz w:val="20"/>
-          <w:szCs w:val="20"/>
-        </w:rPr>
-        <w:t xml:space="preserve"> en un concesionario oficial. Hoy se les habla a todos igual, así que el esfuerzo de contacto se reparte también entre los que iban a volver de todos modos.</w:t>
+        <w:t xml:space="preserve"> Todos los meses entre 6.000 y 7.000 Ranger entran en su ventana de mantenimiento, y cuatro de cada diez no hacen ese service en un concesionario oficial. Como hoy el contacto es igual para todos, buena parte del esfuerzo se va en clientes que habrían vuelto de cualquier manera.</w:t>
       </w:r>
     </w:p>
     <w:p>
@@ -3951,17 +3924,16 @@
           <w:sz w:val="20"/>
           <w:szCs w:val="20"/>
         </w:rPr>
-        <w:t>La solución.</w:t>
-      </w:r>
-      <w:r>
-        <w:rPr>
-          <w:bCs/>
+        <w:t xml:space="preserve">La solución.</w:t>
+      </w:r>
+      <w:r>
+        <w:rPr>
           <w:i w:val="0"/>
           <w:iCs w:val="0"/>
           <w:sz w:val="20"/>
           <w:szCs w:val="20"/>
         </w:rPr>
-        <w:t xml:space="preserve"> Cuando cada Ranger entra en ventana, un modelo estima la probabilidad de que no vuelva y explica el riesgo con sus tres motivos principales. Un segundo análisis reúne los grupos Alto y Medio, aplica reglas operativas y consolida los vehículos por cliente. La web muestra una lista de contacto priorizada con el riesgo original y los motivos de la selección.</w:t>
+        <w:t xml:space="preserve"> En el momento en que una Ranger entra en ventana, un modelo estima la probabilidad de que no vuelva y señala los tres factores que más pesan en ese riesgo. Después, una segunda etapa toma los grupos Alto y Medio, aplica reglas operativas y arma una lista con un único contacto por cliente. Esa lista se consulta en una aplicación web, junto con el riesgo y los motivos de cada caso.</w:t>
       </w:r>
     </w:p>
     <w:p>
@@ -3980,17 +3952,16 @@
           <w:sz w:val="20"/>
           <w:szCs w:val="20"/>
         </w:rPr>
-        <w:t>Qué tan bien funciona.</w:t>
-      </w:r>
-      <w:r>
-        <w:rPr>
-          <w:bCs/>
+        <w:t xml:space="preserve">Qué tan bien funciona.</w:t>
+      </w:r>
+      <w:r>
+        <w:rPr>
           <w:i w:val="0"/>
           <w:iCs w:val="0"/>
           <w:sz w:val="20"/>
           <w:szCs w:val="20"/>
         </w:rPr>
-        <w:t xml:space="preserve"> En meses que el modelo no había visto, el 78 % del 20 % de mayor riesgo no completó su mantenimiento en ventana, frente al 42,6 % del conjunto de test. Bajo el supuesto de que un contacto recupera al 15 % de quienes abandonarían, la simulación estima un 82 % más de services retenidos que el mismo esfuerzo repartido al azar. Ese efecto todavía debe medirse en un piloto; las métricas disponibles evalúan el primer análisis de riesgo.</w:t>
+        <w:t xml:space="preserve"> Lo probamos en meses que el modelo no había visto. Dentro del 20 % que marcó como de mayor riesgo, el 78 % efectivamente no completó el mantenimiento en ventana; en el total del test, esa proporción fue del 42,6 %. Si se supone que un contacto recupera al 15 % de quienes iban a abandonar, la simulación da un 82 % más de services retenidos que con el mismo esfuerzo repartido al azar. Ese 15 % es un supuesto, y el efecto real hay que medirlo en un piloto.</w:t>
       </w:r>
     </w:p>
     <w:p>
@@ -4009,17 +3980,16 @@
           <w:sz w:val="20"/>
           <w:szCs w:val="20"/>
         </w:rPr>
-        <w:t>Qué proponemos. Dos etapas con los CSV actuales:</w:t>
-      </w:r>
-      <w:r>
-        <w:rPr>
-          <w:bCs/>
+        <w:t xml:space="preserve">Qué proponemos.</w:t>
+      </w:r>
+      <w:r>
+        <w:rPr>
           <w:i w:val="0"/>
           <w:iCs w:val="0"/>
           <w:sz w:val="20"/>
           <w:szCs w:val="20"/>
         </w:rPr>
-        <w:t xml:space="preserve"> estimación del riesgo y priorización operativa del contacto. Los segmentos orientan el canal y la propuesta comercial; el segundo paso determina qué clientes entran en el cupo. Un piloto de 90 días con los canales de Ford (Service Leads, FordPass y Service Reminder) medirá el efecto real antes de escalar.</w:t>
+        <w:t xml:space="preserve"> Las dos etapas funcionan con los CSV que Ford ya tiene. El segmento orienta el canal y la oferta, y la segunda etapa decide quién entra en el cupo de contactos. Antes de escalar, un piloto de 90 días con Service Leads, FordPass y Service Reminder mediría el efecto real.</w:t>
       </w:r>
     </w:p>
     <w:p>
@@ -4076,16 +4046,7 @@
           <w:sz w:val="20"/>
           <w:szCs w:val="20"/>
         </w:rPr>
-        <w:t>Esta sección cuenta cómo se construyó la solución y qué tan bien funciona. Cada idea lleva la cifra que la sostiene; las tablas completas están en los Anexos A a</w:t>
-      </w:r>
-      <w:r>
-        <w:rPr>
-          <w:i w:val="0"/>
-          <w:iCs w:val="0"/>
-          <w:sz w:val="20"/>
-          <w:szCs w:val="20"/>
-        </w:rPr>
-        <w:t xml:space="preserve"> J, citados donde corresponde.</w:t>
+        <w:t xml:space="preserve">En esta sección explicamos cómo se construyó la solución y cómo rindió. Las tablas completas están en los Anexos A a J y se citan donde hacen falta.</w:t>
       </w:r>
     </w:p>
     <w:p>
@@ -4122,7 +4083,7 @@
           <w:sz w:val="20"/>
           <w:szCs w:val="20"/>
         </w:rPr>
-        <w:t xml:space="preserve">La agenda de turnos registra cada ítem de servicio por separado. Consolidada a nivel turno, identifica </w:t>
+        <w:t xml:space="preserve">La agenda registra cada ítem de servicio en una fila aparte. Al agruparla por turno aparecen </w:t>
       </w:r>
       <w:r>
         <w:rPr>
@@ -4133,7 +4094,7 @@
           <w:sz w:val="20"/>
           <w:szCs w:val="20"/>
         </w:rPr>
-        <w:t>222.889 mantenimientos programados completados</w:t>
+        <w:t xml:space="preserve">222.889 mantenimientos programados completados</w:t>
       </w:r>
       <w:r>
         <w:rPr>
@@ -4142,7 +4103,7 @@
           <w:sz w:val="20"/>
           <w:szCs w:val="20"/>
         </w:rPr>
-        <w:t>, que son el evento que define si un cliente volvió. El análisis exploratorio se hizo en seis temas, y cada cifra fue recalculada por una verificación independiente con código propio.</w:t>
+        <w:t xml:space="preserve">, que es el evento que usamos para saber si un cliente volvió. El análisis exploratorio se dividió en seis temas, y cada cifra se recalculó en una verificación independiente, con código escrito desde cero.</w:t>
       </w:r>
     </w:p>
     <w:p>
@@ -4159,7 +4120,7 @@
           <w:sz w:val="20"/>
           <w:szCs w:val="20"/>
         </w:rPr>
-        <w:t>Cinco hallazgos cambian cómo hay que mirar el problema (el detalle, con todas sus cifras, está en el Anexo B):</w:t>
+        <w:t xml:space="preserve">Hubo cinco hallazgos que nos hicieron replantear el problema (las cifras completas están en el Anexo B):</w:t>
       </w:r>
     </w:p>
     <w:p>
@@ -4180,14 +4141,14 @@
           <w:sz w:val="20"/>
           <w:szCs w:val="20"/>
         </w:rPr>
-        <w:t>El plan es por kilómetros, no por calendario.</w:t>
-      </w:r>
-      <w:r>
-        <w:rPr>
-          <w:sz w:val="20"/>
-          <w:szCs w:val="20"/>
-        </w:rPr>
-        <w:t xml:space="preserve"> El kilometraje al n-ésimo service converge a 16.000 × n en la Ranger P703 y a 10.000 × n en la P375 (Figura 1), igual que el plan oficial de Ford Argentina. Como una Ranger hace unos 21.500 km por año, esperar "al año" llega tarde: una regla anual abre la ventana cuando el 86 % de los clientes ya vino.</w:t>
+        <w:t xml:space="preserve">El plan es por kilómetros.</w:t>
+      </w:r>
+      <w:r>
+        <w:rPr>
+          <w:sz w:val="20"/>
+          <w:szCs w:val="20"/>
+        </w:rPr>
+        <w:t xml:space="preserve"> El kilometraje al n-ésimo service se acerca a 16.000 × n en la Ranger P703 y a 10.000 × n en la P375 (Figura 1), que es lo que indica el plan oficial de Ford Argentina. Una Ranger recorre unos 21.500 km por año, así que una regla anual llega tarde: cuando abre la ventana, el 86 % de los clientes ya hizo el service.</w:t>
       </w:r>
     </w:p>
     <w:p>
@@ -4208,14 +4169,14 @@
           <w:sz w:val="20"/>
           <w:szCs w:val="20"/>
         </w:rPr>
-        <w:t>El primer service concentra el riesgo.</w:t>
-      </w:r>
-      <w:r>
-        <w:rPr>
-          <w:sz w:val="20"/>
-          <w:szCs w:val="20"/>
-        </w:rPr>
-        <w:t xml:space="preserve"> A 12 meses, el primer service pierde al 36 % de los clientes y el segundo, al 25 %. El que vuelve una vez tiende a quedarse.</w:t>
+        <w:t xml:space="preserve">El primer service es el más frágil.</w:t>
+      </w:r>
+      <w:r>
+        <w:rPr>
+          <w:sz w:val="20"/>
+          <w:szCs w:val="20"/>
+        </w:rPr>
+        <w:t xml:space="preserve"> A 12 meses, el primer service pierde al 36 % de los clientes y el segundo, al 25 %. Quien vuelve una vez suele seguir volviendo.</w:t>
       </w:r>
     </w:p>
     <w:p>
@@ -4236,14 +4197,14 @@
           <w:sz w:val="20"/>
           <w:szCs w:val="20"/>
         </w:rPr>
-        <w:t>La retención cae con la edad del vehículo, de forma sostenida.</w:t>
-      </w:r>
-      <w:r>
-        <w:rPr>
-          <w:sz w:val="20"/>
-          <w:szCs w:val="20"/>
-        </w:rPr>
-        <w:t xml:space="preserve"> No hay un quiebre "al tercer año": la caída es gradual y el escalón mayor está entre el quinto y el sexto año.</w:t>
+        <w:t xml:space="preserve">La retención baja a medida que el vehículo envejece.</w:t>
+      </w:r>
+      <w:r>
+        <w:rPr>
+          <w:sz w:val="20"/>
+          <w:szCs w:val="20"/>
+        </w:rPr>
+        <w:t xml:space="preserve"> No hay un corte brusco en el tercer año. La caída es gradual, y el salto más grande se da entre el quinto y el sexto año.</w:t>
       </w:r>
     </w:p>
     <w:p>
@@ -4264,21 +4225,14 @@
           <w:sz w:val="20"/>
           <w:szCs w:val="20"/>
         </w:rPr>
-        <w:t>Dos columnas son fotos, no historia.</w:t>
-      </w:r>
-      <w:r>
-        <w:rPr>
-          <w:sz w:val="20"/>
-          <w:szCs w:val="20"/>
-        </w:rPr>
-        <w:t xml:space="preserve"> KM y ConnectedStatusARG</w:t>
-      </w:r>
-      <w:r>
-        <w:rPr>
-          <w:sz w:val="20"/>
-          <w:szCs w:val="20"/>
-        </w:rPr>
-        <w:t xml:space="preserve"> guardan el valor del día en que se extrajeron los datos, copiado a todos los turnos anteriores del vehículo. Usarlas para predecir el pasado sería mirar el futuro, así que quedaron afuera (sección 2.2.4).</w:t>
+        <w:t xml:space="preserve">KM y ConnectedStatusARG son fotos del día de extracción.</w:t>
+      </w:r>
+      <w:r>
+        <w:rPr>
+          <w:sz w:val="20"/>
+          <w:szCs w:val="20"/>
+        </w:rPr>
+        <w:t xml:space="preserve"> Ese valor aparece copiado en todos los turnos anteriores del vehículo. Si se usaran para predecir el pasado, el modelo vería información que en ese momento no existía, así que las dejamos afuera (sección 2.2.4).</w:t>
       </w:r>
     </w:p>
     <w:p>
@@ -4299,14 +4253,14 @@
           <w:sz w:val="20"/>
           <w:szCs w:val="20"/>
         </w:rPr>
-        <w:t>El que se va se ve venir, si se mira bien.</w:t>
-      </w:r>
-      <w:r>
-        <w:rPr>
-          <w:sz w:val="20"/>
-          <w:szCs w:val="20"/>
-        </w:rPr>
-        <w:t xml:space="preserve"> La recencia, el ritmo de uso, el atraso respecto del plan, el uso de FordPass y el concesionario separan a quien vuelve de quien no. Los no-shows sólo pesan cuando se los mira junto con la cantidad de turnos, y la encuesta de satisfacción no anticipa nada.</w:t>
+        <w:t xml:space="preserve">Las señales de abandono aparecen antes.</w:t>
+      </w:r>
+      <w:r>
+        <w:rPr>
+          <w:sz w:val="20"/>
+          <w:szCs w:val="20"/>
+        </w:rPr>
+        <w:t xml:space="preserve"> La recencia, el ritmo de uso, el atraso respecto del plan, el uso de FordPass y el concesionario distinguen a quien vuelve de quien no. Los no-shows sólo pesan si se los mira junto con la cantidad de turnos. La encuesta de satisfacción no anticipa nada.</w:t>
       </w:r>
     </w:p>
     <w:p>
@@ -4409,7 +4363,7 @@
           <w:sz w:val="20"/>
           <w:szCs w:val="20"/>
         </w:rPr>
-        <w:t>La ficha deja las reglas exactas de ventana y horizonte "a validar por modelo/año". Las definimos a partir de los datos y quedaron parametrizadas en config/params.json, para que Posventa pueda ajustarlas.</w:t>
+        <w:t xml:space="preserve">La ficha deja las reglas exactas de ventana y horizonte "a validar por modelo/año". Las fijamos a partir de los datos y quedaron como parámetros en config/params.json, para que Posventa pueda cambiarlas sin tocar código.</w:t>
       </w:r>
     </w:p>
     <w:p>
@@ -4428,7 +4382,7 @@
           <w:sz w:val="20"/>
           <w:szCs w:val="20"/>
         </w:rPr>
-        <w:t>La ventana se calcula para cada vehículo.</w:t>
+        <w:t xml:space="preserve">La ventana es propia de cada vehículo.</w:t>
       </w:r>
       <w:r>
         <w:rPr>
@@ -4437,7 +4391,7 @@
           <w:sz w:val="20"/>
           <w:szCs w:val="20"/>
         </w:rPr>
-        <w:t xml:space="preserve"> Parte de su último mantenimiento completado (o del inicio de la garantía, si todavía no hizo el primero), estima cuándo le toca el próximo según su generación y su propio ritmo de uso, abre 30 días antes de ese vencimiento y cierra 90 días después.</w:t>
+        <w:t xml:space="preserve"> El punto de partida es el último mantenimiento completado, o el inicio de la garantía si todavía no hizo el primero. Con su generación y su ritmo de uso se estima cuándo le toca el próximo; la ventana abre 30 días antes de ese vencimiento y cierra 90 días después.</w:t>
       </w:r>
     </w:p>
     <w:p>
@@ -4456,7 +4410,7 @@
           <w:sz w:val="20"/>
           <w:szCs w:val="20"/>
         </w:rPr>
-        <w:t>El target es la definición de la ficha.</w:t>
+        <w:t xml:space="preserve">El target es el de la ficha.</w:t>
       </w:r>
       <w:r>
         <w:rPr>
@@ -4465,7 +4419,7 @@
           <w:sz w:val="20"/>
           <w:szCs w:val="20"/>
         </w:rPr>
-        <w:t xml:space="preserve"> Churn = 1 si el vehículo no completa el próximo mantenimiento programado en la red oficial entre la apertura y el cierre de su ventana. Las ventanas que todavía no cerraron al corte no se etiquetan: son la población a la que se le asigna un score hoy.</w:t>
+        <w:t xml:space="preserve"> Churn = 1 si el vehículo no completa el próximo mantenimiento programado en la red oficial entre la apertura y el cierre de su ventana. Las ventanas que no habían cerrado al momento del corte quedan sin etiqueta: son la población que se puntúa hoy.</w:t>
       </w:r>
     </w:p>
     <w:p>
@@ -4482,7 +4436,7 @@
           <w:sz w:val="20"/>
           <w:szCs w:val="20"/>
         </w:rPr>
-        <w:t xml:space="preserve">Con esa definición quedan </w:t>
+        <w:t xml:space="preserve">Así quedan </w:t>
       </w:r>
       <w:r>
         <w:rPr>
@@ -4493,7 +4447,7 @@
           <w:sz w:val="20"/>
           <w:szCs w:val="20"/>
         </w:rPr>
-        <w:t>142.637 ventanas evaluables</w:t>
+        <w:t xml:space="preserve">142.637 ventanas evaluables</w:t>
       </w:r>
       <w:r>
         <w:rPr>
@@ -4502,7 +4456,7 @@
           <w:sz w:val="20"/>
           <w:szCs w:val="20"/>
         </w:rPr>
-        <w:t xml:space="preserve"> entre 2024 y 2026, con un churn de 41,6 %. La definición completa, elemento por elemento y con su justificación, está en el Anexo C.</w:t>
+        <w:t xml:space="preserve"> entre 2024 y 2026, con un churn de 41,6 %. El Anexo C detalla cada elemento de la definición y por qué lo elegimos.</w:t>
       </w:r>
     </w:p>
     <w:p>
@@ -4521,7 +4475,7 @@
           <w:sz w:val="20"/>
           <w:szCs w:val="20"/>
         </w:rPr>
-        <w:t>Por qué esta ventana y no otra.</w:t>
+        <w:t xml:space="preserve">Por qué esta ventana.</w:t>
       </w:r>
       <w:r>
         <w:rPr>
@@ -4530,16 +4484,7 @@
           <w:sz w:val="20"/>
           <w:szCs w:val="20"/>
         </w:rPr>
-        <w:t xml:space="preserve"> Probamos 36 combinaciones de parámetros. La regla anual es la que peor describe el parque: el retorno real le queda 200 días tarde (Figura 2). Además, contrastamos la definición con una solución hecha por separado, que usaba un horizonte de un mes. La diferencia resultó ser sólo el horizonte: entre el 40 % y el 44 % de los clientes que esa solución daba por perdidos completan el service</w:t>
-      </w:r>
-      <w:r>
-        <w:rPr>
-          <w:i w:val="0"/>
-          <w:iCs w:val="0"/>
-          <w:sz w:val="20"/>
-          <w:szCs w:val="20"/>
-        </w:rPr>
-        <w:t xml:space="preserve"> antes del cierre de nuestra ventana. Son clientes tardíos, no perdidos. El detalle de las alternativas y del contraste está en el Anexo C.</w:t>
+        <w:t xml:space="preserve"> Probamos 36 combinaciones de parámetros. La regla anual es la que peor se ajusta al parque: el retorno real le cae 200 días tarde (Figura 2). También comparamos nuestra definición con la de una solución desarrollada por separado, que usaba un horizonte de un mes, y la única diferencia de fondo era ese horizonte. Entre el 40 % y el 44 % de los clientes que esa solución contaba como perdidos hacen el service antes de que cierre nuestra ventana: vuelven tarde, pero vuelven. El Anexo C tiene las alternativas y la comparación completa.</w:t>
       </w:r>
     </w:p>
     <w:p>
@@ -4641,7 +4586,7 @@
           <w:sz w:val="20"/>
           <w:szCs w:val="20"/>
         </w:rPr>
-        <w:t>Toda la construcción de variables sigue una sola regla: para una ventana que se evalúa en la fecha t, sólo entra información anterior a t. Se implementa con acumulados por vehículo y uniones temporales estrictas, y un notebook verifica que ninguna recencia sea menor o igual a cero.</w:t>
+        <w:t xml:space="preserve">Para construir las variables seguimos una sola regla: si una ventana se evalúa en la fecha t, sólo se usa información anterior a t. En la práctica se resolvió con acumulados por vehículo y uniones temporales estrictas, y un notebook comprueba que ninguna recencia sea menor o igual a cero.</w:t>
       </w:r>
     </w:p>
     <w:p>
@@ -4658,17 +4603,7 @@
           <w:sz w:val="20"/>
           <w:szCs w:val="20"/>
         </w:rPr>
-        <w:t xml:space="preserve">Con esa regla se construyen 86 variables en nueve grupos, desde la recencia y la frecuencia de </w:t>
-      </w:r>
-      <w:r>
-        <w:rPr>
-          <w:i w:val="0"/>
-          <w:iCs w:val="0"/>
-          <w:sz w:val="20"/>
-          <w:szCs w:val="20"/>
-        </w:rPr>
-        <w:lastRenderedPageBreak/>
-        <w:t>visitas hasta el uso del vehículo, el canal de reserva y el concesionario. La lista completa está en el Anexo D.</w:t>
+        <w:t xml:space="preserve">Con esa regla armamos 86 variables, agrupadas en nueve familias que van de la recencia y la frecuencia de visitas al uso del vehículo, el canal de reserva y el concesionario. La lista completa está en el Anexo D.</w:t>
       </w:r>
     </w:p>
     <w:p>
@@ -4687,7 +4622,7 @@
           <w:sz w:val="20"/>
           <w:szCs w:val="20"/>
         </w:rPr>
-        <w:t>Anti-leakage.</w:t>
+        <w:t xml:space="preserve">Anti-leakage.</w:t>
       </w:r>
       <w:r>
         <w:rPr>
@@ -4696,7 +4631,7 @@
           <w:sz w:val="20"/>
           <w:szCs w:val="20"/>
         </w:rPr>
-        <w:t xml:space="preserve"> Quedan afuera KM y ConnectedStatusARG, porque son fotos del día de extracción; los turnos futuros, porque no hay fecha de creación del turno ("ya tiene turno" se usa después del modelo, como regla operativa); y ServiceMonth, porque es nominal. La historia anterior a 2024 no se ve en los datos: se compensa con la antigüedad, el número de service y los meses de historia observable, y una ablación confirma que no distorsiona el resultado.</w:t>
+        <w:t xml:space="preserve"> Excluimos KM y ConnectedStatusARG, por ser fotos del día de extracción; los turnos futuros, porque el sistema no guarda la fecha en que se creó cada turno (el dato "ya tiene turno" se usa después del modelo, como regla operativa), y ServiceMonth, que es nominal. La historia anterior a 2024 no está en los datos. Para compensarlo usamos la antigüedad, el número de service y los meses de historia observable, y una ablación mostró que esa falta no altera el resultado.</w:t>
       </w:r>
     </w:p>
     <w:p>
@@ -4735,7 +4670,7 @@
           <w:sz w:val="20"/>
           <w:szCs w:val="20"/>
         </w:rPr>
-        <w:t>El modelo</w:t>
+        <w:t xml:space="preserve">El modelo</w:t>
       </w:r>
       <w:r>
         <w:rPr>
@@ -4744,16 +4679,7 @@
           <w:sz w:val="20"/>
           <w:szCs w:val="20"/>
         </w:rPr>
-        <w:t xml:space="preserve"> es un LightGBM</w:t>
-      </w:r>
-      <w:r>
-        <w:rPr>
-          <w:i w:val="0"/>
-          <w:iCs w:val="0"/>
-          <w:sz w:val="20"/>
-          <w:szCs w:val="20"/>
-        </w:rPr>
-        <w:t xml:space="preserve"> calibrado. Se compara contra el orden actual (contactar sin priorizar, equivalente al azar), una heurística de reglas y una regresión logística.</w:t>
+        <w:t xml:space="preserve"> es un LightGBM calibrado. Lo comparamos contra el orden actual (contactar sin priorizar, que equivale al azar), contra una heurística de reglas y contra una regresión logística.</w:t>
       </w:r>
     </w:p>
     <w:p>
@@ -4765,23 +4691,12 @@
       </w:pPr>
       <w:r>
         <w:rPr>
-          <w:bCs/>
           <w:i w:val="0"/>
           <w:iCs w:val="0"/>
           <w:sz w:val="20"/>
           <w:szCs w:val="20"/>
         </w:rPr>
-        <w:t>La evaluación separa períodos por fecha de scoring. El modelo se entrenó con ventanas abiertas hasta el 30/09/2025, se calibró con el trimestre siguiente y se evaluó en 19.709 ventanas de enero a marzo de 2026. No usamos validación cruzada aleatoria porque mezclaría ventanas del mismo vehículo y ocultaría cambios en la composición del parque. Sin embargo, algunas etiquetas terminan después del corte de su período: esta versión no purga esos horizontes ni aplica embargo entre entrenamiento, calibración y tes</w:t>
-      </w:r>
-      <w:r>
-        <w:rPr>
-          <w:bCs/>
-          <w:i w:val="0"/>
-          <w:iCs w:val="0"/>
-          <w:sz w:val="20"/>
-          <w:szCs w:val="20"/>
-        </w:rPr>
-        <w:t>t. Las métricas son una evaluación temporal retrospectiva; una validación estricta de disponibilidad histórica queda pendiente (Anexo D).</w:t>
+        <w:t xml:space="preserve">La evaluación separa los períodos por fecha de scoring. El entrenamiento usó ventanas abiertas hasta el 30/09/2025, la calibración el trimestre siguiente y el test 19.709 ventanas de enero a marzo de 2026. Descartamos la validación cruzada aleatoria porque mezcla ventanas de un mismo vehículo y esconde los cambios en la composición del parque. Hay una limitación que conviene aclarar: algunas etiquetas cierran después del corte de su período, y esta versión no purga esos horizontes ni deja un embargo entre entrenamiento, calibración y test. Por eso las métricas son una evaluación temporal retrospectiva, y la validación estricta queda pendiente (Anexo D).</w:t>
       </w:r>
     </w:p>
     <w:p>
@@ -4800,7 +4715,7 @@
           <w:sz w:val="20"/>
           <w:szCs w:val="20"/>
         </w:rPr>
-        <w:t>Ordena mucho mejor que hoy.</w:t>
+        <w:t xml:space="preserve">Ordena mucho mejor que hoy.</w:t>
       </w:r>
       <w:r>
         <w:rPr>
@@ -4809,7 +4724,7 @@
           <w:sz w:val="20"/>
           <w:szCs w:val="20"/>
         </w:rPr>
-        <w:t xml:space="preserve"> Su ROC-AUC es 0,740, contra 0,497 del orden actual, y supera también a la heurística y a la regresión logística. La tabla completa de métricas, con PR-AUC, Brier y error de calibración, está en el Anexo E.</w:t>
+        <w:t xml:space="preserve"> El ROC-AUC es 0,740, contra 0,497 del orden actual, y también supera a la heurística y a la regresión logística. El Anexo E tiene la tabla completa, con PR-AUC, Brier y error de calibración.</w:t>
       </w:r>
     </w:p>
     <w:p>
@@ -4828,7 +4743,7 @@
           <w:sz w:val="20"/>
           <w:szCs w:val="20"/>
         </w:rPr>
-        <w:t>Lo que importa en la operación es a cuántos de los que se van se llega.</w:t>
+        <w:t xml:space="preserve">Lo que cuenta en la operación es a cuántos de los que se van se llega.</w:t>
       </w:r>
       <w:r>
         <w:rPr>
@@ -4837,7 +4752,7 @@
           <w:sz w:val="20"/>
           <w:szCs w:val="20"/>
         </w:rPr>
-        <w:t xml:space="preserve"> Contactando al 20 % de mayor riesgo se alcanza al 36 % de los que iban a abandonar, 1,8 veces más que hoy (Figura 3). Con 3.000 contactos por mes entre todos los concesionarios, se llega al 65 %. Los resultados para otras capacidades están en el Anexo E.</w:t>
+        <w:t xml:space="preserve"> Si se contacta al 20 % de mayor riesgo, se alcanza al 36 % de quienes iban a abandonar, 1,8 veces más que hoy (Figura 3). Con 3.000 contactos por mes entre todos los concesionarios, la cobertura llega al 65 %. Otras capacidades están en el Anexo E.</w:t>
       </w:r>
     </w:p>
     <w:p>
@@ -4914,13 +4829,12 @@
       </w:pPr>
       <w:r>
         <w:rPr>
-          <w:bCs/>
           <w:i w:val="0"/>
           <w:iCs w:val="0"/>
           <w:sz w:val="20"/>
           <w:szCs w:val="20"/>
         </w:rPr>
-        <w:t>La calibración reduce la diferencia entre la probabilidad estimada y el abandono observado. En el test, el error de calibración esperado (ECE) es 0,010, aproximadamente un punto porcentual en promedio por intervalos (Figura 4). Es una medida agregada de esta muestra; no garantiza el resultado de un cliente individual ni el mismo error en nuevos datos.</w:t>
+        <w:t xml:space="preserve">Gracias a la calibración, la probabilidad que da el modelo se parece a la tasa de abandono que después se observa. En el test, el error de calibración esperado (ECE) es 0,010, alrededor de un punto porcentual en promedio (Figura 4). Es un promedio sobre esta muestra: no asegura lo que va a pasar con un cliente en particular ni que el error se mantenga igual con datos nuevos.</w:t>
       </w:r>
     </w:p>
     <w:p>
@@ -4998,23 +4912,12 @@
       </w:pPr>
       <w:r>
         <w:rPr>
-          <w:bCs/>
           <w:i w:val="0"/>
           <w:iCs w:val="0"/>
           <w:sz w:val="20"/>
           <w:szCs w:val="20"/>
         </w:rPr>
-        <w:t>Las ablaciones identifican fuentes de fuga de información y revisan la estabilidad del resultado. Las variantes que quitan grupos de variables o exigen más historia quedan entre 0,735 y 0,739 de ROC-AUC (Anexo E). Usar KM como si fuera el kilometraje de cada visita eleva el ROC-AUC a 0,813, pero incorpora información futura y empeora la calibración; esa variable se excluye. Estos controles no certifican ausencia total de leakage y no resuelven el solapamiento de horizontes señalado en la validación temporal</w:t>
-      </w:r>
-      <w:r>
-        <w:rPr>
-          <w:bCs/>
-          <w:i w:val="0"/>
-          <w:iCs w:val="0"/>
-          <w:sz w:val="20"/>
-          <w:szCs w:val="20"/>
-        </w:rPr>
-        <w:t>.</w:t>
+        <w:t xml:space="preserve">Con las ablaciones buscamos fugas de información y medimos qué tan estable es el resultado. Sacar grupos de variables o exigir más historia deja el ROC-AUC entre 0,735 y 0,739 (Anexo E). En cambio, usar KM como si fuera el kilometraje de cada visita lo sube a 0,813. Esa mejora viene de información futura y además empeora la calibración, por eso la variable no se usa. Estas pruebas no garantizan que no quede ninguna fuga ni resuelven el solapamiento de horizontes que mencionamos más arriba.</w:t>
       </w:r>
     </w:p>
     <w:p>
@@ -5051,7 +4954,7 @@
           <w:sz w:val="20"/>
           <w:szCs w:val="20"/>
         </w:rPr>
-        <w:t>SHAP explica cómo las variables contribuyen al score del LightGBM. La importancia global resume la magnitud media de esos aportes en una muestra de 8.000 ventanas del test; los motivos individuales muestran las variables que más pesan en cada vehículo. Las familias principales son las siguientes (Anexo E):</w:t>
+        <w:t xml:space="preserve">SHAP muestra cuánto aporta cada variable al score del LightGBM. La importancia global promedia la magnitud de esos aportes en una muestra de 8.000 ventanas del test, y los motivos individuales indican qué pesa más en cada vehículo. Las familias que más explican el riesgo son estas (Anexo E):</w:t>
       </w:r>
     </w:p>
     <w:p>
@@ -5072,14 +4975,14 @@
           <w:sz w:val="20"/>
           <w:szCs w:val="20"/>
         </w:rPr>
-        <w:t>Ciclo de vida.</w:t>
-      </w:r>
-      <w:r>
-        <w:rPr>
-          <w:sz w:val="20"/>
-          <w:szCs w:val="20"/>
-        </w:rPr>
-        <w:t xml:space="preserve"> El riesgo crece con la edad del vehículo, su versión y su generación.</w:t>
+        <w:t xml:space="preserve">Ciclo de vida.</w:t>
+      </w:r>
+      <w:r>
+        <w:rPr>
+          <w:sz w:val="20"/>
+          <w:szCs w:val="20"/>
+        </w:rPr>
+        <w:t xml:space="preserve"> El riesgo sube con la edad del vehículo y varía según versión y generación.</w:t>
       </w:r>
     </w:p>
     <w:p>
@@ -5100,14 +5003,14 @@
           <w:sz w:val="20"/>
           <w:szCs w:val="20"/>
         </w:rPr>
-        <w:t>Intensidad de la relación.</w:t>
-      </w:r>
-      <w:r>
-        <w:rPr>
-          <w:sz w:val="20"/>
-          <w:szCs w:val="20"/>
-        </w:rPr>
-        <w:t xml:space="preserve"> El cliente que viene seguido sigue viniendo.</w:t>
+        <w:t xml:space="preserve">Intensidad de la relación.</w:t>
+      </w:r>
+      <w:r>
+        <w:rPr>
+          <w:sz w:val="20"/>
+          <w:szCs w:val="20"/>
+        </w:rPr>
+        <w:t xml:space="preserve"> Quien viene seguido sigue viniendo.</w:t>
       </w:r>
     </w:p>
     <w:p>
@@ -5128,14 +5031,14 @@
           <w:sz w:val="20"/>
           <w:szCs w:val="20"/>
         </w:rPr>
-        <w:t>Uso y atraso.</w:t>
-      </w:r>
-      <w:r>
-        <w:rPr>
-          <w:sz w:val="20"/>
-          <w:szCs w:val="20"/>
-        </w:rPr>
-        <w:t xml:space="preserve"> Quien llegó tarde a su último service tiene más chances de no llegar al próximo.</w:t>
+        <w:t xml:space="preserve">Uso y atraso.</w:t>
+      </w:r>
+      <w:r>
+        <w:rPr>
+          <w:sz w:val="20"/>
+          <w:szCs w:val="20"/>
+        </w:rPr>
+        <w:t xml:space="preserve"> Quien llegó tarde a su último service tiene más probabilidad de no llegar al próximo.</w:t>
       </w:r>
     </w:p>
     <w:p>
@@ -5156,14 +5059,14 @@
           <w:sz w:val="20"/>
           <w:szCs w:val="20"/>
         </w:rPr>
-        <w:t>Flota.</w:t>
-      </w:r>
-      <w:r>
-        <w:rPr>
-          <w:sz w:val="20"/>
-          <w:szCs w:val="20"/>
-        </w:rPr>
-        <w:t xml:space="preserve"> Las flotas grandes entran menos a los concesionarios oficiales.</w:t>
+        <w:t xml:space="preserve">Flota.</w:t>
+      </w:r>
+      <w:r>
+        <w:rPr>
+          <w:sz w:val="20"/>
+          <w:szCs w:val="20"/>
+        </w:rPr>
+        <w:t xml:space="preserve"> Las flotas grandes van menos a los concesionarios oficiales.</w:t>
       </w:r>
     </w:p>
     <w:p>
@@ -5179,11 +5082,18 @@
       </w:pPr>
       <w:r>
         <w:rPr>
-          <w:bCs/>
-          <w:sz w:val="20"/>
-          <w:szCs w:val="20"/>
-        </w:rPr>
-        <w:t>Concesionario. Identifica diferencias de riesgo asociadas al historial de atención y ayuda a orientar la revisión comercial; no demuestra el efecto de cambiar de concesionario.</w:t>
+          <w:b/>
+          <w:sz w:val="20"/>
+          <w:szCs w:val="20"/>
+        </w:rPr>
+        <w:t xml:space="preserve">Concesionario.</w:t>
+      </w:r>
+      <w:r>
+        <w:rPr>
+          <w:sz w:val="20"/>
+          <w:szCs w:val="20"/>
+        </w:rPr>
+        <w:t xml:space="preserve"> Marca diferencias de riesgo según dónde se atendió el cliente y sirve para orientar la revisión comercial. No prueba que cambiar de concesionario cambie el resultado.</w:t>
       </w:r>
     </w:p>
     <w:p>
@@ -5200,16 +5110,7 @@
           <w:sz w:val="20"/>
           <w:szCs w:val="20"/>
         </w:rPr>
-        <w:t>Cada vehículo conserva los tres aportes SHAP de mayor magnitud absoluta, con su dirección. Un valor positivo aumenta el score bruto de abandono y uno negativo lo reduce. Los valores están en log-odds del modelo base, antes de la calibración isotónica: no son puntos de probabilidad y los tres motivos no suman la probabilidad calibrada. SHAP explica la predicción; no estima cuánto cambiaría el resultado por contactar al cliente. Un caso de la población al corte es una Ranger 2019 con 76 % de riesgo, siete año</w:t>
-      </w:r>
-      <w:r>
-        <w:rPr>
-          <w:i w:val="0"/>
-          <w:iCs w:val="0"/>
-          <w:sz w:val="20"/>
-          <w:szCs w:val="20"/>
-        </w:rPr>
-        <w:t>s de antigüedad, menos de un mantenimiento por año y trece meses entre sus dos últimos services.</w:t>
+        <w:t xml:space="preserve">Para cada vehículo se guardan los tres aportes SHAP de mayor magnitud, con su signo: positivo si sube el score de abandono, negativo si lo baja. Están en log-odds del modelo base, antes de la calibración isotónica, así que no son puntos de probabilidad y no suman la probabilidad final. Explican la predicción, no lo que pasaría si se contacta al cliente. Un ejemplo de la población actual es una Ranger 2019 con 76 % de riesgo, siete años de antigüedad, menos de un mantenimiento por año y trece meses entre sus dos últimos services.</w:t>
       </w:r>
     </w:p>
     <w:p>
@@ -5246,17 +5147,7 @@
           <w:sz w:val="20"/>
           <w:szCs w:val="20"/>
         </w:rPr>
-        <w:t xml:space="preserve">El primer análisis divide la población por riesgo en tres grupos. Sus tasas de churn se midieron </w:t>
-      </w:r>
-      <w:r>
-        <w:rPr>
-          <w:i w:val="0"/>
-          <w:iCs w:val="0"/>
-          <w:sz w:val="20"/>
-          <w:szCs w:val="20"/>
-        </w:rPr>
-        <w:lastRenderedPageBreak/>
-        <w:t>en el test temporal y sirven para orientar la estrategia comercial (Anexo F). La selección final para contacto pasa después por el segundo análisis:</w:t>
+        <w:t xml:space="preserve">La primera etapa divide la población en tres grupos según el riesgo. Las tasas de churn de cada grupo se midieron en el test temporal y sirven para definir la estrategia comercial (Anexo F). Quién se contacta finalmente lo decide la segunda etapa:</w:t>
       </w:r>
     </w:p>
     <w:p>
@@ -5277,15 +5168,14 @@
           <w:sz w:val="20"/>
           <w:szCs w:val="20"/>
         </w:rPr>
-        <w:t>Alto:</w:t>
-      </w:r>
-      <w:r>
-        <w:rPr>
-          <w:bCs/>
-          <w:sz w:val="20"/>
-          <w:szCs w:val="20"/>
-        </w:rPr>
-        <w:t xml:space="preserve"> el 20 % de mayor riesgo, donde el 78 % no completó el service en test. Para los casos seleccionados, se propone contacto personal del asesor con una oferta concreta: descuento por continuidad, precio fijo o turno con retiro y entrega. Canal previsto: Service Leads.</w:t>
+        <w:t xml:space="preserve">Alto:</w:t>
+      </w:r>
+      <w:r>
+        <w:rPr>
+          <w:sz w:val="20"/>
+          <w:szCs w:val="20"/>
+        </w:rPr>
+        <w:t xml:space="preserve"> el 20 % de mayor riesgo; en el test, el 78 % no completó el service. Para los seleccionados proponemos un llamado del asesor con una oferta concreta: descuento por continuidad, precio fijo o turno con retiro y entrega. Canal: Service Leads.</w:t>
       </w:r>
     </w:p>
     <w:p>
@@ -5306,15 +5196,14 @@
           <w:sz w:val="20"/>
           <w:szCs w:val="20"/>
         </w:rPr>
-        <w:t>Medio:</w:t>
-      </w:r>
-      <w:r>
-        <w:rPr>
-          <w:bCs/>
-          <w:sz w:val="20"/>
-          <w:szCs w:val="20"/>
-        </w:rPr>
-        <w:t xml:space="preserve"> el 30 % siguiente, donde el 47 % no completó el service en test. Para los casos seleccionados, se propone recordatorio personalizado con turno sugerido por FordPass o WhatsApp, y seguimiento a los 10 días si no agenda.</w:t>
+        <w:t xml:space="preserve">Medio:</w:t>
+      </w:r>
+      <w:r>
+        <w:rPr>
+          <w:sz w:val="20"/>
+          <w:szCs w:val="20"/>
+        </w:rPr>
+        <w:t xml:space="preserve"> el 30 % siguiente, con un 47 % que no completó el service en el test. Para los seleccionados, un recordatorio personalizado con turno sugerido por FordPass o WhatsApp, y un segundo mensaje a los 10 días si no agenda.</w:t>
       </w:r>
     </w:p>
     <w:p>
@@ -5335,15 +5224,14 @@
           <w:sz w:val="20"/>
           <w:szCs w:val="20"/>
         </w:rPr>
-        <w:t>Bajo:</w:t>
-      </w:r>
-      <w:r>
-        <w:rPr>
-          <w:bCs/>
-          <w:sz w:val="20"/>
-          <w:szCs w:val="20"/>
-        </w:rPr>
-        <w:t xml:space="preserve"> el 50 % restante, donde el 26 % no completó el service en test. Queda fuera del segundo análisis de contacto prioritario y conserva la propuesta de recordatorio automático de Service Reminder.</w:t>
+        <w:t xml:space="preserve">Bajo:</w:t>
+      </w:r>
+      <w:r>
+        <w:rPr>
+          <w:sz w:val="20"/>
+          <w:szCs w:val="20"/>
+        </w:rPr>
+        <w:t xml:space="preserve"> el 50 % restante, con un 26 % que no completó el service en el test. No entra en la segunda etapa y sigue recibiendo el recordatorio automático de Service Reminder.</w:t>
       </w:r>
     </w:p>
     <w:p>
@@ -5360,7 +5248,7 @@
           <w:sz w:val="20"/>
           <w:szCs w:val="20"/>
         </w:rPr>
-        <w:t>La separación 20/30/50 se conserva para auditar el resultado del modelo. Alto y Medio alimentan juntos la segunda etapa: el riesgo de abandono, por sí solo, no demuestra que el cliente responderá a un contacto. Un score de 1 tampoco prueba que sea irrecuperable y no constituye una exclusión.</w:t>
+        <w:t xml:space="preserve">Mantenemos la división 20/30/50 para poder auditar lo que dice el modelo. Alto y Medio pasan juntos a la segunda etapa porque un riesgo alto no implica que el cliente vaya a responder a un llamado. Por la misma razón, un score de 1 no se toma como cliente perdido ni lo deja afuera.</w:t>
       </w:r>
     </w:p>
     <w:p>
@@ -5397,7 +5285,7 @@
           <w:sz w:val="20"/>
           <w:szCs w:val="20"/>
         </w:rPr>
-        <w:t>Se aplica una política explicable sobre Alto y Medio, utilizando las columnas que ya genera el scoring. No se reentrena el mismo modelo sobre su propia selección ni se calcula una probabilidad nueva de retorno. La probabilidad publicada sigue siendo prob_churn, el riesgo de no completar el mantenimiento dentro del horizonte.</w:t>
+        <w:t xml:space="preserve">La segunda etapa aplica reglas explícitas sobre Alto y Medio, usando columnas que el scoring ya genera. No se reentrena el modelo ni se calcula otra probabilidad. La probabilidad que se publica sigue siendo prob_churn, el riesgo de no completar el mantenimiento dentro del horizonte.</w:t>
       </w:r>
     </w:p>
     <w:p>
@@ -5414,7 +5302,7 @@
           <w:sz w:val="20"/>
           <w:szCs w:val="20"/>
         </w:rPr>
-        <w:t>Un vehículo queda en Contactar si tiene customer_id válido, no tiene turno agendado, conserva al menos 14 días hasta el cierre, registra algún mantenimiento observado y tiene concesionario del último service. Los casos sin historia o concesionario suficientes quedan en Revisar. Los demás estados son Con turno, Sin margen y Sin identificador, según el motivo que impide incorporarlos al cupo. La señal de turno puede corresponder a otro servicio; debe confirmarse en la agenda antes de actuar.</w:t>
+        <w:t xml:space="preserve">Un vehículo pasa a Contactar si tiene un customer_id válido, no tiene turno agendado, le quedan al menos 14 días hasta el cierre, tiene algún mantenimiento registrado y un concesionario asociado a su último service. Si le falta historia o concesionario, va a Revisar. El resto queda como Con turno, Sin margen o Sin identificador, según qué le impide entrar en el cupo. El turno agendado puede ser de otro servicio, así que conviene confirmarlo en la agenda antes de actuar.</w:t>
       </w:r>
     </w:p>
     <w:p>
@@ -5431,7 +5319,7 @@
           <w:sz w:val="20"/>
           <w:szCs w:val="20"/>
         </w:rPr>
-        <w:t>Entre vehículos habilitados se ordena primero por presencia de algún motivo SHAP positivo asociado a señales operativas, luego por relación reciente (último mantenimiento dentro de 730 días), riesgo de abandono descendente y días restantes ascendentes. Los identificadores resuelven empates de manera estable. La ausencia de un motivo operativo entre los tres SHAP principales no excluye a un cliente; estos motivos explican riesgo y no demuestran que modificar una variable cambie su respuesta.</w:t>
+        <w:t xml:space="preserve">Entre los vehículos habilitados, el orden es el siguiente: primero los que tienen algún motivo SHAP positivo ligado a una señal operativa; después, los que tuvieron un mantenimiento en los últimos 730 días; luego, mayor riesgo y menos días restantes. Los empates se resuelven por identificador, para que el orden sea siempre el mismo. No tener un motivo operativo entre los tres principales no excluye a nadie. Además, esos motivos describen el riesgo y no prueban que cambiar una variable cambie la respuesta del cliente.</w:t>
       </w:r>
     </w:p>
     <w:p>
@@ -5448,16 +5336,7 @@
           <w:sz w:val="20"/>
           <w:szCs w:val="20"/>
         </w:rPr>
-        <w:t>Se elige un vehículo representativo habilitado por customer_id y se conservan los demás vehículos y grupos asociados dentro del universo Alto y Medio. Si un cliente tiene una unidad habilitada y otra excluida, representa al cliente la habilitada aunque su riesgo sea menor. La capacidad predeterminada es de 3.000 clientes por corrida, configurable: los primeros integran la selección y el resto permanece en lista de espera. Este cupo por ejecución no descuenta contactos de corridas anteriores ni equivale a un</w:t>
-      </w:r>
-      <w:r>
-        <w:rPr>
-          <w:i w:val="0"/>
-          <w:iCs w:val="0"/>
-          <w:sz w:val="20"/>
-          <w:szCs w:val="20"/>
-        </w:rPr>
-        <w:t xml:space="preserve"> control mensual de campaña.</w:t>
+        <w:t xml:space="preserve">Por cada customer_id se elige un vehículo habilitado como representante, y el resto de sus unidades y grupos dentro de Alto y Medio queda asociado. Si un cliente tiene una unidad habilitada y otra excluida, lo representa la habilitada aunque tenga menos riesgo. La capacidad por defecto es de 3.000 clientes por corrida y se puede cambiar. Los primeros 3.000 quedan seleccionados y el resto en lista de espera. El cupo se aplica a cada corrida por separado: no descuenta contactos de corridas anteriores ni funciona como límite mensual de campaña.</w:t>
       </w:r>
     </w:p>
     <w:p>
@@ -5474,7 +5353,7 @@
           <w:sz w:val="20"/>
           <w:szCs w:val="20"/>
         </w:rPr>
-        <w:t>Cada fila final muestra customer_id, vehicle_id representativo, fecha, probabilidad entre 0 y 1, grupo original y tres motivos SHAP. Agrega estado de contacto, orden, selección por cupo y motivos operativos. La auditoría por vehículo permite revisar por qué un caso entró, quedó pendiente o no pasó a contacto. Para medir quién vuelve gracias a la intervención se necesitan resultados de contactos y un grupo de control; referencia metodológica: scikit-uplift, https://www.uplift-modeling.com/en/latest/.</w:t>
+        <w:t xml:space="preserve">Cada fila de la lista final trae customer_id, el vehicle_id representativo, fecha, probabilidad entre 0 y 1, grupo original y los tres motivos SHAP, más el estado de contacto, el orden, si entró en el cupo y los motivos operativos. La auditoría por vehículo permite ver por qué un caso entró, quedó pendiente o se descartó. Para saber quién vuelve gracias al contacto hacen falta resultados de contactos reales y un grupo de control; como referencia metodológica, scikit-uplift: https://www.uplift-modeling.com/en/latest/.</w:t>
       </w:r>
     </w:p>
     <w:p>
@@ -5486,24 +5365,22 @@
       </w:pPr>
       <w:r>
         <w:rPr>
-          <w:bCs/>
+          <w:b/>
           <w:i w:val="0"/>
           <w:iCs w:val="0"/>
           <w:sz w:val="20"/>
           <w:szCs w:val="20"/>
         </w:rPr>
-        <w:t xml:space="preserve">Cómo se opera. La secuencia es CSV de ventas y agenda, ventanas y features, entrenamiento y </w:t>
-      </w:r>
-      <w:r>
-        <w:rPr>
-          <w:bCs/>
+        <w:t xml:space="preserve">Cómo se opera.</w:t>
+      </w:r>
+      <w:r>
+        <w:rPr>
           <w:i w:val="0"/>
           <w:iCs w:val="0"/>
           <w:sz w:val="20"/>
           <w:szCs w:val="20"/>
         </w:rPr>
-        <w:lastRenderedPageBreak/>
-        <w:t>calibración, scoring con SHAP, segmentación y segundo análisis operativo. La aplicación presenta la lista final por cliente, la lista inicial completa y la auditoría del segundo paso. La integración mensual a los canales de Ford y el reentrenamiento trimestral son propuestas de operación; requieren el despliegue y la validación de identidad, consentimiento y turnos en el CRM. Los extractos actuales no contienen teléfonos ni permisos de contacto.</w:t>
+        <w:t xml:space="preserve"> El flujo va de los CSV de ventas y agenda a las ventanas y features, y de ahí al entrenamiento y la calibración, el scoring con SHAP, la segmentación y la segunda etapa. La aplicación muestra la lista final por cliente, la lista inicial completa y la auditoría de la segunda etapa. La integración mensual con los canales de Ford y el reentrenamiento cada tres meses son propuestas: requieren desplegar la solución y validar identidad, consentimiento y turnos en el CRM. Los extractos actuales no tienen teléfonos ni permisos de contacto.</w:t>
       </w:r>
     </w:p>
     <w:p>
@@ -5540,7 +5417,7 @@
           <w:sz w:val="20"/>
           <w:szCs w:val="20"/>
         </w:rPr>
-        <w:t>Aunque el target es la retención de service, el dataset permite ver la recompra que motiva el desafío: el 20,6 % de las ventas de 2024-2026 son de clientes que ya tenían otra Ranger y la llevaban al service. Con esos casos se puede entrenar un segundo modelo, directamente sobre la recompra (Anexo G y sección 5).</w:t>
+        <w:t xml:space="preserve">Aunque el target es la retención de service, en el dataset se puede ver la recompra que motiva el desafío: el 20,6 % de las ventas de 2024-2026 corresponde a clientes que ya tenían otra Ranger y la llevaban al service. Con esos casos se podría entrenar un segundo modelo apuntado directamente a la recompra (Anexo G y sección 5).</w:t>
       </w:r>
     </w:p>
     <w:p>
@@ -5577,16 +5454,7 @@
           <w:sz w:val="20"/>
           <w:szCs w:val="20"/>
         </w:rPr>
-        <w:t>El pipeline completo (scripts/run_pipeline.py) procesa los CSV, entrena y evalúa el modelo, genera el scoring actual y ejecuta el segundo análisis de contacto. Las reglas de ventana, los supuestos de negocio y la política de contacto se mantienen en archivos de configuración. scripts/run_contacto.py permite recalcular sólo la segunda etapa a partir de scores_actuales.parquet, sin reentrenar. La aplicación guarda los archivos, resultados y corridas de cada dataset por separado. El resumen de contacto registr</w:t>
-      </w:r>
-      <w:r>
-        <w:rPr>
-          <w:i w:val="0"/>
-          <w:iCs w:val="0"/>
-          <w:sz w:val="20"/>
-          <w:szCs w:val="20"/>
-        </w:rPr>
-        <w:t>a la política y el hash SHA-256 del scoring utilizado para comprobar que la lista corresponde a su fuente.</w:t>
+        <w:t xml:space="preserve">El pipeline completo (scripts/run_pipeline.py) lee los CSV, entrena y evalúa el modelo, genera el scoring actual y corre la segunda etapa. Las reglas de ventana, los supuestos de negocio y la política de contacto están en archivos de configuración. Con scripts/run_contacto.py se puede recalcular sólo la segunda etapa a partir de scores_actuales.parquet, sin reentrenar. La aplicación guarda por separado los archivos, resultados y corridas de cada dataset. El resumen de contacto registra la política usada y el hash SHA-256 del scoring de origen, para poder comprobar que la lista salió de ese scoring.</w:t>
       </w:r>
     </w:p>
     <w:p>
@@ -5623,7 +5491,7 @@
           <w:sz w:val="20"/>
           <w:szCs w:val="20"/>
         </w:rPr>
-        <w:t>La navegación superior reúne cuatro secciones de trabajo. El selector de conjunto de datos permanece visible en todas ellas y determina qué entradas, modelo y resultados se consultan. La interfaz usa los azules de la marca, fondos claros y controles compactos; el margen superior evita que la navegación cubra el selector, también en pantallas angostas.</w:t>
+        <w:t xml:space="preserve">La aplicación tiene cuatro secciones en la barra superior. El selector de conjunto de datos está siempre visible y define qué datos, modelo y resultados se muestran en cada una.</w:t>
       </w:r>
     </w:p>
     <w:p>
@@ -5635,12 +5503,22 @@
       </w:pPr>
       <w:r>
         <w:rPr>
+          <w:b/>
           <w:i w:val="0"/>
           <w:iCs w:val="0"/>
           <w:sz w:val="20"/>
           <w:szCs w:val="20"/>
         </w:rPr>
-        <w:t>Carga de datos. Se asigna un nombre al conjunto y se cargan los CSV de ventas y agenda. La aplicación valida el formato y las columnas requeridas, permite revisar fechas y archivos, y selecciona el conjunto al guardarlo. Las fechas de fin de entrenamiento, fin de calibración y corte de datos deben corresponder al período completo del extracto. El usuario puede cambiar entre conjuntos guardados sin mezclar resultados.</w:t>
+        <w:t xml:space="preserve">Carga de datos.</w:t>
+      </w:r>
+      <w:r>
+        <w:rPr>
+          <w:i w:val="0"/>
+          <w:iCs w:val="0"/>
+          <w:sz w:val="20"/>
+          <w:szCs w:val="20"/>
+        </w:rPr>
+        <w:t xml:space="preserve"> Se le pone un nombre al conjunto y se suben los CSV de ventas y agenda. La aplicación revisa el formato y las columnas, muestra fechas y archivos, y deja seleccionado el conjunto al guardarlo. Las fechas de fin de entrenamiento, fin de calibración y corte tienen que corresponder al período completo del extracto. Se puede pasar de un conjunto guardado a otro sin que se mezclen los resultados.</w:t>
       </w:r>
     </w:p>
     <w:p>
@@ -5652,12 +5530,22 @@
       </w:pPr>
       <w:r>
         <w:rPr>
+          <w:b/>
           <w:i w:val="0"/>
           <w:iCs w:val="0"/>
           <w:sz w:val="20"/>
           <w:szCs w:val="20"/>
         </w:rPr>
-        <w:t>Entrenamiento. La acción principal ejecuta la preparación, el entrenamiento, la evaluación y la priorización de contactos. Si ya existen scores, se puede actualizar sólo el segundo filtro. La pantalla muestra la etapa actual, el tiempo transcurrido, el registro en vivo y la opción de cancelar; conserva historial, duración y estado de cada ejecución. Una única corrida puede estar activa a la vez y las vistas del conjunto en proceso esperan hasta que finalice.</w:t>
+        <w:t xml:space="preserve">Entrenamiento.</w:t>
+      </w:r>
+      <w:r>
+        <w:rPr>
+          <w:i w:val="0"/>
+          <w:iCs w:val="0"/>
+          <w:sz w:val="20"/>
+          <w:szCs w:val="20"/>
+        </w:rPr>
+        <w:t xml:space="preserve"> Un botón corre la preparación, el entrenamiento, la evaluación y la priorización de contactos. Si los scores ya existen, se puede actualizar sólo la segunda etapa. Mientras corre, la pantalla muestra la etapa, el tiempo transcurrido y el registro en vivo, y permite cancelar. Queda un historial con la duración y el estado de cada ejecución. Sólo puede haber una corrida activa a la vez, y las vistas del conjunto que se está procesando esperan a que termine.</w:t>
       </w:r>
     </w:p>
     <w:p>
@@ -5669,12 +5557,22 @@
       </w:pPr>
       <w:r>
         <w:rPr>
+          <w:b/>
           <w:i w:val="0"/>
           <w:iCs w:val="0"/>
           <w:sz w:val="20"/>
           <w:szCs w:val="20"/>
         </w:rPr>
-        <w:t>Resultados. El dashboard abre en los clientes seleccionados por el segundo filtro y distingue los elegibles en espera, los casos para revisar y las exclusiones. Los filtros combinan situación, grupo, concesionario e identificadores de cliente o vehículo, con opción de restablecerlos. La descarga de la vista coincide con lo filtrado; otra descarga incluye todos los seleccionados de la corrida. Las pestañas de auditoría y análisis inicial conservan trazabilidad del 20/30/50 y de cada vehículo.</w:t>
+        <w:t xml:space="preserve">Resultados.</w:t>
+      </w:r>
+      <w:r>
+        <w:rPr>
+          <w:i w:val="0"/>
+          <w:iCs w:val="0"/>
+          <w:sz w:val="20"/>
+          <w:szCs w:val="20"/>
+        </w:rPr>
+        <w:t xml:space="preserve"> Abre en los clientes que eligió la segunda etapa y separa a los que están en espera, los casos a revisar y las exclusiones. Se puede filtrar por situación, grupo, concesionario e identificador de cliente o vehículo, y volver a los filtros originales. Una descarga baja exactamente lo que está filtrado y otra, todos los seleccionados de la corrida. Las pestañas de auditoría y análisis inicial permiten rastrear la división 20/30/50 y cada vehículo.</w:t>
       </w:r>
     </w:p>
     <w:p>
@@ -5691,7 +5589,7 @@
           <w:sz w:val="20"/>
           <w:szCs w:val="20"/>
         </w:rPr>
-        <w:t>Cada fila final mantiene customer_id, vehicle_id representativo, fecha de scoring, probabilidad de abandono entre 0 y 1, grupo inicial y tres motivos SHAP. También muestra orden global, situación, concesionario, días de margen, motivos operativos y vehículos asociados dentro de Alto y Medio. Al consultar un cliente se ven el signo y el valor de sus aportes SHAP y las unidades consolidadas; filtrar la lista no recalcula el cupo ni cambia la prioridad global.</w:t>
+        <w:t xml:space="preserve">Además de los campos de la lista final, cada fila muestra el orden global, la situación, el concesionario, los días de margen, los motivos operativos y los vehículos asociados dentro de Alto y Medio. Al abrir un cliente se ven el signo y el valor de sus aportes SHAP y las unidades consolidadas. Filtrar la lista no recalcula el cupo ni cambia el orden global.</w:t>
       </w:r>
     </w:p>
     <w:p>
@@ -5703,12 +5601,13 @@
       </w:pPr>
       <w:r>
         <w:rPr>
+          <w:b/>
           <w:i w:val="0"/>
           <w:iCs w:val="0"/>
           <w:sz w:val="20"/>
           <w:szCs w:val="20"/>
         </w:rPr>
-        <w:t xml:space="preserve">Eficiencia del modelo. Las pestañas Calidad, Tiempos, Controles de datos y SHAP reúnen </w:t>
+        <w:t xml:space="preserve">Eficiencia del modelo.</w:t>
       </w:r>
       <w:r>
         <w:rPr>
@@ -5717,8 +5616,7 @@
           <w:sz w:val="20"/>
           <w:szCs w:val="20"/>
         </w:rPr>
-        <w:lastRenderedPageBreak/>
-        <w:t>métricas de test, capacidad de contacto, calibración, períodos de evaluación, tiempos por etapa, controles de fuga de información e importancia global e individual. La comparación de modelos y las columnas SHAP incluyen ayudas al pasar el cursor para explicar su significado y unidad. Las tablas y sus descargas siempre corresponden al conjunto activo.</w:t>
+        <w:t xml:space="preserve"> Tiene cuatro pestañas (Calidad, Tiempos, Controles de datos y SHAP) con las métricas de test, la capacidad de contacto, la calibración, los períodos de evaluación, los tiempos por etapa, los controles de fuga y la importancia global e individual de las variables. La comparación de modelos y las columnas SHAP tienen ayudas al pasar el cursor que explican qué significa cada valor y en qué unidad está. Las tablas y descargas siempre corresponden al conjunto activo.</w:t>
       </w:r>
     </w:p>
     <w:p>
@@ -5735,7 +5633,7 @@
           <w:sz w:val="20"/>
           <w:szCs w:val="20"/>
         </w:rPr>
-        <w:t>Las nuevas corridas guardan tiempo total y por etapa en reports/modelo/tiempos_pipeline.json, con inicio, fin, estado y corte. La medición incluye lectura, cálculo y exportación; entrenamiento incluye baselines y calibración, y el scoring actual incluye su SHAP. Las corridas anteriores sin telemetría muestran Sin registro o sólo el total disponible en el historial. Un proceso fallido conserva tiempos parciales, identificados como tales; no se presentan como medición de un modelo completo.</w:t>
+        <w:t xml:space="preserve">Cada corrida nueva guarda el tiempo total y el de cada etapa en reports/modelo/tiempos_pipeline.json, con inicio, fin, estado y corte. El tiempo incluye lectura, cálculo y exportación; el del entrenamiento suma baselines y calibración, y el del scoring actual incluye su SHAP. Las corridas anteriores, que no registraban tiempos, aparecen como Sin registro o con el total del historial. Si un proceso falla, se guardan los tiempos parciales marcados como tales.</w:t>
       </w:r>
     </w:p>
     <w:p>
@@ -5752,7 +5650,7 @@
           <w:sz w:val="20"/>
           <w:szCs w:val="20"/>
         </w:rPr>
-        <w:t>Los controles de leakage muestran exclusión de snapshots, eventos previos al scoring, separación temporal y cruces de horizonte, además de las ablaciones disponibles del dataset. Son evidencia parcial, no un certificado de ausencia de fuga. La vista SHAP ordena variables por magnitud absoluta media en log-odds y permite buscar vehicle_id o window_id en la muestra de test y descargarla filtrada.</w:t>
+        <w:t xml:space="preserve">Los controles de leakage muestran la exclusión de snapshots, que los eventos sean previos al scoring, la separación temporal y los horizontes que cruzan cortes, junto con las ablaciones disponibles. Son evidencia parcial y no certifican que no haya fugas. La vista SHAP ordena las variables por magnitud media en log-odds y permite buscar un vehicle_id o window_id en la muestra de test y descargar el resultado filtrado.</w:t>
       </w:r>
     </w:p>
     <w:p>
@@ -5807,7 +5705,7 @@
           <w:sz w:val="20"/>
           <w:szCs w:val="20"/>
         </w:rPr>
-        <w:t>El .zip que acompaña este informe incluye los entregables que no caben en el documento:</w:t>
+        <w:t xml:space="preserve">El .zip que acompaña este informe trae lo que no entra en el documento:</w:t>
       </w:r>
     </w:p>
     <w:p>
@@ -5828,14 +5726,14 @@
           <w:sz w:val="20"/>
           <w:szCs w:val="20"/>
         </w:rPr>
-        <w:t>Dataset analítico documentado y definición reproducible del target</w:t>
-      </w:r>
-      <w:r>
-        <w:rPr>
-          <w:sz w:val="20"/>
-          <w:szCs w:val="20"/>
-        </w:rPr>
-        <w:t>: config/params.json, src/repurchase/ventanas.py, docs/01_hallazgos_eda.md y docs/02_decisiones_y_descartes.md.</w:t>
+        <w:t xml:space="preserve">Dataset analítico documentado y definición reproducible del target</w:t>
+      </w:r>
+      <w:r>
+        <w:rPr>
+          <w:sz w:val="20"/>
+          <w:szCs w:val="20"/>
+        </w:rPr>
+        <w:t xml:space="preserve">: config/params.json, src/repurchase/ventanas.py y los informes del análisis exploratorio en reports/eda/.</w:t>
       </w:r>
     </w:p>
     <w:p>
@@ -5856,14 +5754,14 @@
           <w:sz w:val="20"/>
           <w:szCs w:val="20"/>
         </w:rPr>
-        <w:t>Pipeline de features, modelo entrenado y evaluación temporal</w:t>
-      </w:r>
-      <w:r>
-        <w:rPr>
-          <w:sz w:val="20"/>
-          <w:szCs w:val="20"/>
-        </w:rPr>
-        <w:t>: src/repurchase/, scripts/run_pipeline.py, data/models/ (modelo, calibrador, métricas), reports/modelo/ (resumen de la corrida, lift por decil, calibración, ROI, sensibilidad, ablaciones).</w:t>
+        <w:t xml:space="preserve">Pipeline de features, modelo entrenado y evaluación temporal</w:t>
+      </w:r>
+      <w:r>
+        <w:rPr>
+          <w:sz w:val="20"/>
+          <w:szCs w:val="20"/>
+        </w:rPr>
+        <w:t xml:space="preserve">: src/repurchase/, scripts/run_pipeline.py, data/models/ (modelo, calibrador, métricas) y reports/modelo/ (resumen de la corrida, lift por decil, calibración, ROI, sensibilidad, ablaciones).</w:t>
       </w:r>
     </w:p>
     <w:p>
@@ -5879,11 +5777,18 @@
       </w:pPr>
       <w:r>
         <w:rPr>
-          <w:bCs/>
-          <w:sz w:val="20"/>
-          <w:szCs w:val="20"/>
-        </w:rPr>
-        <w:t>Explicación global e individual: data/models/shap_global.csv contiene mean_abs_shap_logodds en la unidad original; data/models/test_drivers_muestra.parquet guarda los motivos del test y el scoring actual conserva los tres drivers de cada vehículo. La Figura 7 y el dashboard muestran la magnitud SHAP en log-odds.</w:t>
+          <w:b/>
+          <w:sz w:val="20"/>
+          <w:szCs w:val="20"/>
+        </w:rPr>
+        <w:t xml:space="preserve">Explicación global e individual</w:t>
+      </w:r>
+      <w:r>
+        <w:rPr>
+          <w:sz w:val="20"/>
+          <w:szCs w:val="20"/>
+        </w:rPr>
+        <w:t xml:space="preserve">: data/models/shap_global.csv tiene mean_abs_shap_logodds en su unidad original; data/models/test_drivers_muestra.parquet guarda los motivos del test, y el scoring actual conserva los tres drivers de cada vehículo. La Figura 7 y el dashboard muestran la magnitud SHAP en log-odds.</w:t>
       </w:r>
     </w:p>
     <w:p>
@@ -5904,15 +5809,14 @@
           <w:sz w:val="20"/>
           <w:szCs w:val="20"/>
         </w:rPr>
-        <w:t>Resultados de ambas etapas:</w:t>
-      </w:r>
-      <w:r>
-        <w:rPr>
-          <w:bCs/>
-          <w:sz w:val="20"/>
-          <w:szCs w:val="20"/>
-        </w:rPr>
-        <w:t xml:space="preserve"> data/processed/scores_actuales.csv conserva el scoring por vehículo; candidatos_contacto.csv conserva la auditoría de Alto y Medio; contactos_por_cliente.csv contiene la consolidación final; contacto_resumen.json registra cantidades y política aplicada.</w:t>
+        <w:t xml:space="preserve">Resultados de ambas etapas</w:t>
+      </w:r>
+      <w:r>
+        <w:rPr>
+          <w:sz w:val="20"/>
+          <w:szCs w:val="20"/>
+        </w:rPr>
+        <w:t xml:space="preserve">: data/processed/scores_actuales.csv tiene el scoring por vehículo; candidatos_contacto.csv, la auditoría de Alto y Medio; contactos_por_cliente.csv, la lista final consolidada, y contacto_resumen.json, las cantidades y la política aplicada.</w:t>
       </w:r>
     </w:p>
     <w:p>
@@ -5928,11 +5832,18 @@
       </w:pPr>
       <w:r>
         <w:rPr>
-          <w:bCs/>
-          <w:sz w:val="20"/>
-          <w:szCs w:val="20"/>
-        </w:rPr>
-        <w:t>Aplicación de uso: webapp/ con Carga de datos, Entrenamiento, Resultados y Eficiencia del modelo; incluye selección de datasets, auditoría, filtros, descargas y explicación individual. app/app.py conserva el dashboard analítico del estudio. docs/03_pitch_trials_day.md documenta la propuesta de activación.</w:t>
+          <w:b/>
+          <w:sz w:val="20"/>
+          <w:szCs w:val="20"/>
+        </w:rPr>
+        <w:t xml:space="preserve">Aplicación</w:t>
+      </w:r>
+      <w:r>
+        <w:rPr>
+          <w:sz w:val="20"/>
+          <w:szCs w:val="20"/>
+        </w:rPr>
+        <w:t xml:space="preserve">: webapp/, con las secciones Carga de datos, Entrenamiento, Resultados y Eficiencia del modelo. Incluye selección de datasets, auditoría, filtros, descargas y explicación por cliente.</w:t>
       </w:r>
     </w:p>
     <w:p>
@@ -5953,14 +5864,14 @@
           <w:sz w:val="20"/>
           <w:szCs w:val="20"/>
         </w:rPr>
-        <w:t>Evidencia</w:t>
-      </w:r>
-      <w:r>
-        <w:rPr>
-          <w:sz w:val="20"/>
-          <w:szCs w:val="20"/>
-        </w:rPr>
-        <w:t>: reports/eda/ (seis análisis con verificación independiente), notebooks/ (tres notebooks ejecutados), reports/revision_cruzada/ (comparación con la solución independiente y su verificación).</w:t>
+        <w:t xml:space="preserve">Evidencia</w:t>
+      </w:r>
+      <w:r>
+        <w:rPr>
+          <w:sz w:val="20"/>
+          <w:szCs w:val="20"/>
+        </w:rPr>
+        <w:t xml:space="preserve">: reports/eda/ (seis análisis, cada uno con su verificación independiente) y notebooks/ (tres notebooks ejecutados).</w:t>
       </w:r>
     </w:p>
     <w:p>
@@ -5977,16 +5888,7 @@
           <w:sz w:val="20"/>
           <w:szCs w:val="20"/>
         </w:rPr>
-        <w:t>Al final de este documento, los Anexos reúnen la evidencia completa: datos recibidos (A), hallazgos con todas sus cifras (B), definición de la ventana y alternativas descartadas (C), features y validación (D), resultados completos y ablaciones (E), segmentos y formato de integración (F), recompra observable (G), impacto por capacidad de contacto (H), preguntas abiertas para Ford (I) y reproducibilidad (J). Otras figuras están disponibles en reports/figures/: curvas del primer service</w:t>
-      </w:r>
-      <w:r>
-        <w:rPr>
-          <w:i w:val="0"/>
-          <w:iCs w:val="0"/>
-          <w:sz w:val="20"/>
-          <w:szCs w:val="20"/>
-        </w:rPr>
-        <w:t xml:space="preserve"> de la cohorte 2024, precisión-recall, segmentos, distribución de intervalos, tasa de uso, estacionalidad, identidad y flotas, censura a la izquierda y snapshot de conectividad.</w:t>
+        <w:t xml:space="preserve">Los Anexos, al final del documento, reúnen la evidencia completa: datos recibidos (A), hallazgos con todas sus cifras (B), definición de la ventana y alternativas descartadas (C), features y validación (D), resultados completos y ablaciones (E), segmentos y formato de integración (F), recompra observable (G), impacto según capacidad de contacto (H), preguntas abiertas para Ford (I) y reproducibilidad (J). En reports/figures/ hay más figuras: curvas del primer service de la cohorte 2024, precisión-recall, segmentos, distribución de intervalos, tasa de uso, estacionalidad, identidad y flotas, censura a la izquierda y snapshot de conectividad.</w:t>
       </w:r>
     </w:p>
     <w:p>
@@ -6038,16 +5940,7 @@
           <w:sz w:val="20"/>
           <w:szCs w:val="20"/>
         </w:rPr>
-        <w:t>La solución no introduce un riesgo de ciberseguridad nuevo: corre dentro del entorno analítico que Ford ya opera (GCP BigQuery y Python), no expone endpoints</w:t>
-      </w:r>
-      <w:r>
-        <w:rPr>
-          <w:i w:val="0"/>
-          <w:iCs w:val="0"/>
-          <w:sz w:val="20"/>
-          <w:szCs w:val="20"/>
-        </w:rPr>
-        <w:t xml:space="preserve"> externos, no envía datos a servicios de terceros y no usa modelos generativos ni texto libre para calcular el riesgo. La analizamos contra los marcos de referencia habituales: la </w:t>
+        <w:t xml:space="preserve">La solución no agrega riesgos de ciberseguridad nuevos. Corre dentro del entorno analítico que Ford ya usa (GCP BigQuery y Python), no expone endpoints externos, no manda datos a terceros y no usa modelos generativos ni texto libre para calcular el riesgo. La revisamos contra los marcos de referencia habituales: la </w:t>
       </w:r>
       <w:r>
         <w:rPr>
@@ -6058,7 +5951,7 @@
           <w:sz w:val="20"/>
           <w:szCs w:val="20"/>
         </w:rPr>
-        <w:t>Ley 25.326 de Protección de Datos Personales</w:t>
+        <w:t xml:space="preserve">Ley 25.326 de Protección de Datos Personales</w:t>
       </w:r>
       <w:r>
         <w:rPr>
@@ -6078,7 +5971,7 @@
           <w:sz w:val="20"/>
           <w:szCs w:val="20"/>
         </w:rPr>
-        <w:t>ISO/IEC 27001</w:t>
+        <w:t xml:space="preserve">ISO/IEC 27001</w:t>
       </w:r>
       <w:r>
         <w:rPr>
@@ -6098,7 +5991,7 @@
           <w:sz w:val="20"/>
           <w:szCs w:val="20"/>
         </w:rPr>
-        <w:t>NIST Cybersecurity Framework 2.0</w:t>
+        <w:t xml:space="preserve">NIST Cybersecurity Framework 2.0</w:t>
       </w:r>
       <w:r>
         <w:rPr>
@@ -6118,7 +6011,7 @@
           <w:sz w:val="20"/>
           <w:szCs w:val="20"/>
         </w:rPr>
-        <w:t>NIST AI Risk Management Framework</w:t>
+        <w:t xml:space="preserve">NIST AI Risk Management Framework</w:t>
       </w:r>
       <w:r>
         <w:rPr>
@@ -6127,7 +6020,27 @@
           <w:sz w:val="20"/>
           <w:szCs w:val="20"/>
         </w:rPr>
-        <w:t xml:space="preserve"> (riesgos propios de los sistemas de IA) y las listas de riesgos de OWASP para machine learning.</w:t>
+        <w:t xml:space="preserve"> (riesgos propios de los sistemas de IA) y las listas de riesgos de </w:t>
+      </w:r>
+      <w:r>
+        <w:rPr>
+          <w:b/>
+          <w:bCs/>
+          <w:i w:val="0"/>
+          <w:iCs w:val="0"/>
+          <w:sz w:val="20"/>
+          <w:szCs w:val="20"/>
+        </w:rPr>
+        <w:t xml:space="preserve">OWASP</w:t>
+      </w:r>
+      <w:r>
+        <w:rPr>
+          <w:i w:val="0"/>
+          <w:iCs w:val="0"/>
+          <w:sz w:val="20"/>
+          <w:szCs w:val="20"/>
+        </w:rPr>
+        <w:t xml:space="preserve"> para machine learning.</w:t>
       </w:r>
     </w:p>
     <w:tbl>
@@ -6829,7 +6742,7 @@
           <w:sz w:val="20"/>
           <w:szCs w:val="20"/>
         </w:rPr>
-        <w:t>Ningún dato del challenge se envió a servicios externos durante el desarrollo. Las herramientas de IA se usaron sobre código y documentación, y todos los resultados provienen de ejecutar código sobre los datos recibidos dentro del entorno autorizado.</w:t>
+        <w:t xml:space="preserve">Durante el desarrollo no se envió ningún dato del challenge a servicios externos. Usamos herramientas de IA sobre el código y la documentación, y todos los resultados salen de ejecutar código sobre los datos recibidos, dentro del entorno autorizado.</w:t>
       </w:r>
     </w:p>
     <w:p>
@@ -6898,13 +6811,12 @@
       </w:pPr>
       <w:r>
         <w:rPr>
-          <w:bCs/>
           <w:i w:val="0"/>
           <w:iCs w:val="0"/>
           <w:sz w:val="20"/>
           <w:szCs w:val="20"/>
         </w:rPr>
-        <w:t>La solución utiliza Python y librerías de código abierto (pandas, scikit-learn, LightGBM, SHAP y Streamlit). Se propone integrarla con BigQuery y los canales existentes de Ford (Service Leads, Service Reminder y FordPass). El tiempo de cómputo depende del volumen de datos y del equipo: la aplicación registra las duraciones de las nuevas corridas para dimensionar la operación.</w:t>
+        <w:t xml:space="preserve">La solución usa Python y librerías de código abierto (pandas, scikit-learn, LightGBM, SHAP y Streamlit), y proponemos integrarla con BigQuery y con los canales que Ford ya tiene: Service Leads, Service Reminder y FordPass. El tiempo de cómputo depende del volumen de datos y del equipo; con el extracto actual, el pipeline completo corre en pocos minutos y la aplicación registra la duración de cada corrida.</w:t>
       </w:r>
     </w:p>
     <w:tbl>
@@ -7380,17 +7292,16 @@
           <w:sz w:val="20"/>
           <w:szCs w:val="20"/>
         </w:rPr>
-        <w:t>El beneficio se calcula con supuestos editables.</w:t>
-      </w:r>
-      <w:r>
-        <w:rPr>
-          <w:bCs/>
+        <w:t xml:space="preserve">El beneficio depende de supuestos que Ford puede cambiar.</w:t>
+      </w:r>
+      <w:r>
+        <w:rPr>
           <w:i w:val="0"/>
           <w:iCs w:val="0"/>
           <w:sz w:val="20"/>
           <w:szCs w:val="20"/>
         </w:rPr>
-        <w:t xml:space="preserve"> Suponemos que un contacto recupera al 15 % de los clientes que se iban, que un service retenido vale USD 250 y que un contacto cuesta USD 3; Ford puede reemplazarlos por sus propios números (Anexo H). Bajo estos supuestos, priorizar al 20 % de mayor riesgo estima un 82 % más de services retenidos que el mismo esfuerzo repartido al azar. Es una simulación del ranking de la primera etapa, no una mejora medida del segundo filtro.</w:t>
+        <w:t xml:space="preserve"> Tomamos que un contacto recupera al 15 % de los clientes que se iban, que un service retenido vale USD 250 y que un contacto cuesta USD 3 (Anexo H). Con esos números, priorizar al 20 % de mayor riesgo da un 82 % más de services retenidos que repartir el mismo esfuerzo al azar. Es una simulación sobre el ranking de la primera etapa y no mide la segunda.</w:t>
       </w:r>
     </w:p>
     <w:p>
@@ -7402,13 +7313,12 @@
       </w:pPr>
       <w:r>
         <w:rPr>
-          <w:bCs/>
           <w:i w:val="0"/>
           <w:iCs w:val="0"/>
           <w:sz w:val="20"/>
           <w:szCs w:val="20"/>
         </w:rPr>
-        <w:t>En los tres meses de test, esa simulación estima unos USD 52.000 de margen incremental; anualizada, del orden de USD 200.000, sin contar la recompra. La recuperación de la inversión durante el primer trimestre depende de que los supuestos de respuesta al contacto y de valor del service se cumplan. El piloto permitirá contrastarlos.</w:t>
+        <w:t xml:space="preserve">Sobre los tres meses de test, la simulación da unos USD 52.000 de margen incremental, que anualizados son del orden de USD 200.000, sin contar la recompra. Que la inversión se recupere en el primer trimestre depende de que esos supuestos se cumplan, y el piloto sirve justamente para comprobarlo.</w:t>
       </w:r>
     </w:p>
     <w:p>
@@ -7427,17 +7337,16 @@
           <w:sz w:val="20"/>
           <w:szCs w:val="20"/>
         </w:rPr>
-        <w:t>La sensibilidad económica también es condicional a esos supuestos.</w:t>
-      </w:r>
-      <w:r>
-        <w:rPr>
-          <w:bCs/>
+        <w:t xml:space="preserve">La conclusión aguanta supuestos más pesimistas.</w:t>
+      </w:r>
+      <w:r>
+        <w:rPr>
           <w:i w:val="0"/>
           <w:iCs w:val="0"/>
           <w:sz w:val="20"/>
           <w:szCs w:val="20"/>
         </w:rPr>
-        <w:t xml:space="preserve"> Con una recuperación del 5 % y un service de USD 100, el ranking todavía supera la priorización uniforme en la simulación. El umbral p ≥ 0,08 es una regla de rentabilidad teórica bajo el supuesto uniforme de respuesta; no sustituye la segunda etapa ni demuestra que un cliente concreto volverá gracias al llamado.</w:t>
+        <w:t xml:space="preserve"> Con una recuperación del 5 % y un service de USD 100, el ranking sigue rindiendo más que la priorización uniforme en la simulación. El umbral p ≥ 0,08 es un punto de rentabilidad teórico, calculado con una respuesta uniforme al contacto; no reemplaza a la segunda etapa ni dice que un cliente puntual vaya a volver por el llamado.</w:t>
       </w:r>
     </w:p>
     <w:p>
@@ -7449,13 +7358,12 @@
       </w:pPr>
       <w:r>
         <w:rPr>
-          <w:bCs/>
           <w:i w:val="0"/>
           <w:iCs w:val="0"/>
           <w:sz w:val="20"/>
           <w:szCs w:val="20"/>
         </w:rPr>
-        <w:t>Contactar a quien iba a volver puede sumar costo o subsidiar un retorno que ocurriría igual; no contactar a quien se va puede perder el service y la relación. El segundo paso ordena la oportunidad operativa dentro de Alto y Medio y aplica el cupo de clientes. La ganancia incremental y la conveniencia de cada incentivo deberán estimarse con los resultados del piloto.</w:t>
+        <w:t xml:space="preserve">Hay costos de los dos lados. Llamar a quien iba a volver igual gasta un contacto o regala un beneficio innecesario, y no llamar a quien se está yendo puede costar el service y la relación. La segunda etapa ordena las oportunidades dentro de Alto y Medio y aplica el cupo, pero la ganancia real y la conveniencia de cada incentivo se van a conocer con los resultados del piloto.</w:t>
       </w:r>
     </w:p>
     <w:p>
@@ -7474,7 +7382,7 @@
           <w:sz w:val="20"/>
           <w:szCs w:val="20"/>
         </w:rPr>
-        <w:t>Cómo se mide.</w:t>
+        <w:t xml:space="preserve">Cómo se mide.</w:t>
       </w:r>
       <w:r>
         <w:rPr>
@@ -7483,7 +7391,7 @@
           <w:sz w:val="20"/>
           <w:szCs w:val="20"/>
         </w:rPr>
-        <w:t xml:space="preserve"> Proponemos un piloto de 90 días. Dentro de cada decil de riesgo, la mitad de los clientes recibe la acción de su grupo y la otra mitad sigue con el proceso actual; la asignación es aleatoria por cliente (todos sus vehículos en el mismo grupo) y estratificada por concesionario. Se mide el mantenimiento completado a 30 y a 120 días, por decil, acción, concesionario y mes. Con 6.000 a 7.000 ventanas por mes, una mejora de 5 puntos se detecta en dos meses.</w:t>
+        <w:t xml:space="preserve"> Proponemos un piloto de 90 días. En cada decil de riesgo, la mitad de los clientes recibe la acción de su grupo y la otra mitad sigue con el proceso actual. La asignación es al azar por cliente (todos sus vehículos van al mismo grupo) y estratificada por concesionario. Se mide el mantenimiento completado a 30 y a 120 días, por decil, acción, concesionario y mes. Con 6.000 a 7.000 ventanas por mes, una mejora de 5 puntos se detecta en dos meses.</w:t>
       </w:r>
     </w:p>
     <w:p>
@@ -7587,7 +7495,7 @@
           <w:sz w:val="20"/>
           <w:szCs w:val="20"/>
         </w:rPr>
-        <w:t>La innovación de esta propuesta no está en el algoritmo, que es el estándar de la industria, sino en cómo se definió el problema y en la evidencia que la sostiene. Se resume en cuatro palabras:</w:t>
+        <w:t xml:space="preserve">El algoritmo es el estándar de la industria. Lo que distingue a esta propuesta es cómo planteamos el problema y la evidencia que la respalda, que resumimos en cuatro puntos:</w:t>
       </w:r>
     </w:p>
     <w:p>
@@ -7608,14 +7516,14 @@
           <w:sz w:val="20"/>
           <w:szCs w:val="20"/>
         </w:rPr>
-        <w:t>Precisa.</w:t>
-      </w:r>
-      <w:r>
-        <w:rPr>
-          <w:sz w:val="20"/>
-          <w:szCs w:val="20"/>
-        </w:rPr>
-        <w:t xml:space="preserve"> Cada Ranger tiene su propio calendario, según su generación y sus kilómetros reales, en lugar de una fecha fija. La ventana se validó contra el plan oficial de Ford, contra 36 combinaciones de parámetros y contra una solución independiente, que mostró que el horizonte es la decisión que más pesa.</w:t>
+        <w:t xml:space="preserve">Precisa.</w:t>
+      </w:r>
+      <w:r>
+        <w:rPr>
+          <w:sz w:val="20"/>
+          <w:szCs w:val="20"/>
+        </w:rPr>
+        <w:t xml:space="preserve"> Cada Ranger tiene su propio calendario, calculado con su generación y sus kilómetros reales, en vez de una fecha fija. La ventana se contrastó con el plan oficial de Ford, con 36 combinaciones de parámetros y con una solución hecha por separado; esa comparación mostró que el horizonte es la decisión que más pesa.</w:t>
       </w:r>
     </w:p>
     <w:p>
@@ -7631,11 +7539,18 @@
       </w:pPr>
       <w:r>
         <w:rPr>
-          <w:bCs/>
-          <w:sz w:val="20"/>
-          <w:szCs w:val="20"/>
-        </w:rPr>
-        <w:t>Honesta. Excluimos las fotos de kilometraje y conectividad de los predictores históricos. La ablación con KM muestra una mejora aparente de ROC-AUC de 0,740 a 0,813 al incorporar información futura. La aplicación muestra los controles disponibles y los cruces de horizonte que aún requieren una evaluación con purga o embargo.</w:t>
+          <w:b/>
+          <w:sz w:val="20"/>
+          <w:szCs w:val="20"/>
+        </w:rPr>
+        <w:t xml:space="preserve">Honesta.</w:t>
+      </w:r>
+      <w:r>
+        <w:rPr>
+          <w:sz w:val="20"/>
+          <w:szCs w:val="20"/>
+        </w:rPr>
+        <w:t xml:space="preserve"> Sacamos de los predictores históricos las fotos de kilometraje y conectividad. Con KM, el ROC-AUC subía de 0,740 a 0,813, pero esa mejora venía de información futura. La aplicación muestra los controles hechos y los horizontes que cruzan cortes, que todavía necesitan una evaluación con purga o embargo.</w:t>
       </w:r>
     </w:p>
     <w:p>
@@ -7656,15 +7571,14 @@
           <w:sz w:val="20"/>
           <w:szCs w:val="20"/>
         </w:rPr>
-        <w:t>Clara.</w:t>
-      </w:r>
-      <w:r>
-        <w:rPr>
-          <w:bCs/>
-          <w:sz w:val="20"/>
-          <w:szCs w:val="20"/>
-        </w:rPr>
-        <w:t xml:space="preserve"> Las probabilidades de abandono están calibradas y cada vehículo conserva sus tres motivos SHAP en castellano. La segunda etapa agrega estado, orden y motivos operativos, con reglas explícitas de turno, margen, historia, concesionario y consolidación por cliente.</w:t>
+        <w:t xml:space="preserve">Clara.</w:t>
+      </w:r>
+      <w:r>
+        <w:rPr>
+          <w:sz w:val="20"/>
+          <w:szCs w:val="20"/>
+        </w:rPr>
+        <w:t xml:space="preserve"> Las probabilidades están calibradas y cada vehículo trae sus tres motivos SHAP en castellano. La segunda etapa suma el estado, el orden y los motivos operativos, con reglas explícitas sobre turno, margen, historia, concesionario y consolidación por cliente.</w:t>
       </w:r>
     </w:p>
     <w:p>
@@ -7685,14 +7599,14 @@
           <w:sz w:val="20"/>
           <w:szCs w:val="20"/>
         </w:rPr>
-        <w:t>Verificada.</w:t>
-      </w:r>
-      <w:r>
-        <w:rPr>
-          <w:sz w:val="20"/>
-          <w:szCs w:val="20"/>
-        </w:rPr>
-        <w:t xml:space="preserve"> Cada análisis fue recalculado por un revisor independiente con código propio; lo que no resistió se corrigió y quedó registrado. El contraste con la solución independiente se hizo con el mismo estándar.</w:t>
+        <w:t xml:space="preserve">Verificada.</w:t>
+      </w:r>
+      <w:r>
+        <w:rPr>
+          <w:sz w:val="20"/>
+          <w:szCs w:val="20"/>
+        </w:rPr>
+        <w:t xml:space="preserve"> Cada análisis lo recalculó un revisor independiente, con código propio. Lo que no se sostuvo se corrigió y quedó documentado, y la comparación con la solución independiente siguió el mismo criterio.</w:t>
       </w:r>
     </w:p>
     <w:p>
@@ -7709,16 +7623,7 @@
           <w:sz w:val="20"/>
           <w:szCs w:val="20"/>
         </w:rPr>
-        <w:t>Además, el trabajo deja dos aportes para Ford. Primero, hallazgos de negocio que contradicen la intuición y están respaldados por datos: el plan es por kilómetros y no anual, el primer service concentra el churn, los no-shows sólo pesan junto con la cantidad de turnos, el concesionario es un motivo estable y accionable, y Ford ya tiene un incentivo por continuidad que vale la pena comunicar. Segundo, la recompra se puede medir dentro del mismo dataset</w:t>
-      </w:r>
-      <w:r>
-        <w:rPr>
-          <w:i w:val="0"/>
-          <w:iCs w:val="0"/>
-          <w:sz w:val="20"/>
-          <w:szCs w:val="20"/>
-        </w:rPr>
-        <w:t>, lo que abre un segundo modelo directo sobre el objetivo de largo plazo del desafío.</w:t>
+        <w:t xml:space="preserve">El trabajo deja además dos aportes concretos para Ford. El primero son hallazgos de negocio que van contra la intuición y están respaldados por los datos: el plan es por kilómetros y no anual, el primer service concentra el churn, los no-shows sólo pesan junto con la cantidad de turnos, el concesionario es un factor estable y accionable, y Ford ya tiene un incentivo por continuidad que conviene comunicar mejor. El segundo es que la recompra se puede medir con el mismo dataset, lo que habilita un segundo modelo enfocado en el objetivo de largo plazo del desafío.</w:t>
       </w:r>
     </w:p>
     <w:p>
@@ -7799,7 +7704,7 @@
           <w:sz w:val="20"/>
           <w:szCs w:val="20"/>
         </w:rPr>
-        <w:t>Ahora, antes de escalar.</w:t>
+        <w:t xml:space="preserve">Antes de escalar.</w:t>
       </w:r>
       <w:r>
         <w:rPr>
@@ -7808,7 +7713,7 @@
           <w:sz w:val="20"/>
           <w:szCs w:val="20"/>
         </w:rPr>
-        <w:t xml:space="preserve"> Validar con Posventa las dos reglas que fijan el horizonte: con cuánta anticipación conviene contactar (−30 o −60 días) y cuántos días después del vencimiento Ford considera perdida la oportunidad (+60, +90 o +120). Correr el piloto aleatorizado de 90 días e integrar el score a Service Leads y Service Reminder.</w:t>
+        <w:t xml:space="preserve"> Definir con Posventa las dos reglas que fijan el horizonte: con cuánta anticipación conviene contactar (−30 o −60 días) y cuántos días después del vencimiento se da por perdida la oportunidad (+60, +90 o +120). Correr el piloto aleatorizado de 90 días e integrar el score a Service Leads y Service Reminder.</w:t>
       </w:r>
     </w:p>
     <w:p>
@@ -7820,23 +7725,22 @@
       </w:pPr>
       <w:r>
         <w:rPr>
-          <w:bCs/>
+          <w:b/>
           <w:i w:val="0"/>
           <w:iCs w:val="0"/>
           <w:sz w:val="20"/>
           <w:szCs w:val="20"/>
         </w:rPr>
-        <w:t>En los próximos meses. Validar los umbrales de la política de contacto con Posventa y conectar identidad y consentimiento al CRM. Completar los tests de seguridad temporal y la evaluación con purga o embargo de horizontes, agregar intervalos de confianza y realizar una validación prospectiva sobre ventanas posteriores al entrenamiento. Pedir un extracto nuevo para una segunda validación ciega. Incorporar telemetría del vehículo para individualizar la ventana del primer service, hoy imprecisa (±140 días). La</w:t>
-      </w:r>
-      <w:r>
-        <w:rPr>
-          <w:bCs/>
+        <w:t xml:space="preserve">En los próximos meses.</w:t>
+      </w:r>
+      <w:r>
+        <w:rPr>
           <w:i w:val="0"/>
           <w:iCs w:val="0"/>
           <w:sz w:val="20"/>
           <w:szCs w:val="20"/>
         </w:rPr>
-        <w:t xml:space="preserve"> medición de tiempos de ejecución y el vínculo por hash entre scoring y contacto ya están implementados.</w:t>
+        <w:t xml:space="preserve"> Ajustar con Posventa los umbrales de la política de contacto y conectar identidad y consentimiento con el CRM. Completar los tests de seguridad temporal y la evaluación con purga o embargo de horizontes, sumar intervalos de confianza y hacer una validación prospectiva sobre ventanas posteriores al entrenamiento. Pedir un extracto nuevo para una segunda validación a ciegas. Incorporar telemetría del vehículo para afinar la ventana del primer service, que hoy tiene un margen de ±140 días. La medición de tiempos y el vínculo por hash entre scoring y contacto ya están hechos.</w:t>
       </w:r>
     </w:p>
     <w:p>
@@ -7855,17 +7759,16 @@
           <w:sz w:val="20"/>
           <w:szCs w:val="20"/>
         </w:rPr>
-        <w:t>Después.</w:t>
-      </w:r>
-      <w:r>
-        <w:rPr>
-          <w:bCs/>
+        <w:t xml:space="preserve">Después.</w:t>
+      </w:r>
+      <w:r>
+        <w:rPr>
           <w:i w:val="0"/>
           <w:iCs w:val="0"/>
           <w:sz w:val="20"/>
           <w:szCs w:val="20"/>
         </w:rPr>
-        <w:t xml:space="preserve"> Entrenar un modelo de recompra Ranger a Ranger sobre los dueños activos. Con registros de contacto, grupo de control y mantenimiento posterior, evaluar un modelo de uplift que estime el efecto incremental del contacto. La política operativa de la segunda etapa funciona ya con los CSV actuales; esos datos adicionales permitirían reemplazar sus prioridades por evidencia sobre respuesta causal.</w:t>
+        <w:t xml:space="preserve"> Entrenar un modelo de recompra Ranger a Ranger sobre los dueños activos. Con registros de contacto, grupo de control y mantenimiento posterior, probar un modelo de uplift que estime cuánto cambia el resultado por el contacto. La segunda etapa ya funciona con los CSV actuales, y esos datos permitirían reemplazar sus reglas por evidencia de respuesta real.</w:t>
       </w:r>
     </w:p>
     <w:p>
@@ -7884,7 +7787,7 @@
           <w:sz w:val="20"/>
           <w:szCs w:val="20"/>
         </w:rPr>
-        <w:t>Replicabilidad.</w:t>
+        <w:t xml:space="preserve">Replicabilidad.</w:t>
       </w:r>
       <w:r>
         <w:rPr>
@@ -7893,7 +7796,7 @@
           <w:sz w:val="20"/>
           <w:szCs w:val="20"/>
         </w:rPr>
-        <w:t xml:space="preserve"> La solución depende sólo de dos tablas que Ford tiene para toda su gama y toda la región (ventas y agenda), de un plan de mantenimiento por modelo y de una tasa de uso por vehículo. Extenderla a otros modelos es cambiar el intervalo del plan en la configuración; extenderla a otro país, apuntar a las mismas tablas de BigQuery. Las preguntas que Ford puede responder para afinarla están en el Anexo I.</w:t>
+        <w:t xml:space="preserve"> La solución necesita dos tablas que Ford tiene para toda su gama y toda la región (ventas y agenda), un plan de mantenimiento por modelo y una tasa de uso por vehículo. Para llevarla a otro modelo alcanza con cambiar el intervalo del plan en la configuración, y para otro país, con apuntar a las mismas tablas de BigQuery. En el Anexo I dejamos las preguntas que Ford podría responder para ajustarla.</w:t>
       </w:r>
     </w:p>
     <w:p>
@@ -7956,7 +7859,7 @@
           <w:sz w:val="20"/>
           <w:szCs w:val="20"/>
         </w:rPr>
-        <w:t>Ford pierde cuatro de cada diez mantenimientos en ventana, y los pierde hablándole igual a todos.</w:t>
+        <w:t xml:space="preserve">Ford pierde cuatro de cada diez mantenimientos en ventana, y hoy les habla a todos sus clientes de la misma manera.</w:t>
       </w:r>
     </w:p>
     <w:p>
@@ -7973,16 +7876,7 @@
           <w:sz w:val="20"/>
           <w:szCs w:val="20"/>
         </w:rPr>
-        <w:t>Esta propuesta convierte la población elegible en un análisis de riesgo por vehículo y una lista operativa por cliente. La primera etapa conserva probabilidad calibrada, segmento y tres motivos SHAP. La segunda reúne Alto y Medio, verifica las condiciones de contacto, consolida las unidades y selecciona según el cupo. Las métricas de recall del 36 % con el 20 % de la población y del 65 % con 3.000 contactos mensuales corresponden al ranking de riesgo evaluado en test; no miden el efecto de la nueva política</w:t>
-      </w:r>
-      <w:r>
-        <w:rPr>
-          <w:i w:val="0"/>
-          <w:iCs w:val="0"/>
-          <w:sz w:val="20"/>
-          <w:szCs w:val="20"/>
-        </w:rPr>
-        <w:t xml:space="preserve"> ni del contacto.</w:t>
+        <w:t xml:space="preserve">Con esta propuesta, cada vehículo en ventana tiene un riesgo estimado y cada concesionario, una lista de clientes para contactar. La primera etapa da una probabilidad calibrada, un segmento y tres motivos SHAP. La segunda junta Alto y Medio, revisa las condiciones de contacto, agrupa las unidades por cliente y selecciona hasta completar el cupo. Las cifras de cobertura (36 % de los que se van contactando al 20 % de la población y 65 % con 3.000 contactos por mes) corresponden al ranking de riesgo en el test; el efecto del contacto todavía no está medido.</w:t>
       </w:r>
     </w:p>
     <w:p>
@@ -7999,7 +7893,7 @@
           <w:sz w:val="20"/>
           <w:szCs w:val="20"/>
         </w:rPr>
-        <w:t>Funciona con lo que Ford ya tiene y se prueba en 90 días. Los próximos pasos son validar el horizonte con Posventa, integrar el score a Service Leads y Service Reminder, y correr el piloto midiendo por decil, acción, concesionario y mes. Todo lo necesario está en el .zip adjunto y se reproduce con un comando.</w:t>
+        <w:t xml:space="preserve">Funciona con los datos que Ford ya tiene y se puede probar en 90 días. Los próximos pasos son validar el horizonte con Posventa, integrar el score a Service Leads y Service Reminder y correr el piloto, midiendo por decil, acción, concesionario y mes. Todo lo necesario está en el .zip adjunto y se reproduce con un solo comando.</w:t>
       </w:r>
       <w:bookmarkEnd w:id="4"/>
     </w:p>
@@ -8034,7 +7928,7 @@
           <w:sz w:val="20"/>
           <w:szCs w:val="20"/>
         </w:rPr>
-        <w:t>Estos anexos reúnen la evidencia que sostiene el cuerpo del informe. Cada uno se cita desde la sección correspondiente.</w:t>
+        <w:t xml:space="preserve">Los anexos reúnen la evidencia detrás del cuerpo del informe, y cada uno se cita en la sección que corresponde.</w:t>
       </w:r>
     </w:p>
     <w:p>
@@ -8420,16 +8314,7 @@
           <w:sz w:val="20"/>
           <w:szCs w:val="20"/>
         </w:rPr>
-        <w:t>De los 492.442 turnos, 342.691 concluyeron, 101.222 se cancelaron (en su mayoría, reprogramaciones) y 27.237 fueron no-show</w:t>
-      </w:r>
-      <w:r>
-        <w:rPr>
-          <w:i w:val="0"/>
-          <w:iCs w:val="0"/>
-          <w:sz w:val="20"/>
-          <w:szCs w:val="20"/>
-        </w:rPr>
-        <w:t>. 222.889 turnos son mantenimientos programados completados. Corte de datos: 25/08/2026.</w:t>
+        <w:t xml:space="preserve">De los 492.442 turnos, 342.691 se concluyeron, 101.222 se cancelaron (la mayoría por reprogramación) y 27.237 fueron no-show. Del total, 222.889 son mantenimientos programados completados. Corte de datos: 25/08/2026.</w:t>
       </w:r>
     </w:p>
     <w:p>
@@ -8461,21 +8346,14 @@
           <w:sz w:val="20"/>
           <w:szCs w:val="20"/>
         </w:rPr>
-        <w:t>Plan por kilómetros.</w:t>
-      </w:r>
-      <w:r>
-        <w:rPr>
-          <w:sz w:val="20"/>
-          <w:szCs w:val="20"/>
-        </w:rPr>
-        <w:t xml:space="preserve"> El kilometraje al n-ésimo service converge a 16.000 × n en la P703 y a 10.000 × n en la P375, en línea con el plan oficial publicado por Ford Argentina (16.000 km ó 12 meses en la Ranger nueva; 10.000 km ó</w:t>
-      </w:r>
-      <w:r>
-        <w:rPr>
-          <w:sz w:val="20"/>
-          <w:szCs w:val="20"/>
-        </w:rPr>
-        <w:t xml:space="preserve"> 1 año en la anterior). La regla "15.000 km o 1 año" que nos dio el tutor es aproximada: el nominal es 16.000 y en la práctica manda el km. La mediana entre mantenimientos consecutivos es de 165 a 200 días según cómo se mida (por evento o por vehículo), y alrededor del 10 % de los retornos tarda más de un año. La mediana de uso del parque es de 21.514 km por año.</w:t>
+        <w:t xml:space="preserve">Plan por kilómetros.</w:t>
+      </w:r>
+      <w:r>
+        <w:rPr>
+          <w:sz w:val="20"/>
+          <w:szCs w:val="20"/>
+        </w:rPr>
+        <w:t xml:space="preserve"> El kilometraje al n-ésimo service se acerca a 16.000 × n en la P703 y a 10.000 × n en la P375, en línea con el plan oficial que publica Ford Argentina (16.000 km o 12 meses en la Ranger nueva; 10.000 km o 1 año en la anterior). La regla de "15.000 km o 1 año" que nos pasó el tutor es una aproximación: el valor nominal es 16.000 y en la práctica manda el kilometraje. La mediana entre mantenimientos consecutivos va de 165 a 200 días según cómo se mida (por evento o por vehículo), y cerca del 10 % de los retornos tarda más de un año. El parque recorre una mediana de 21.514 km por año.</w:t>
       </w:r>
     </w:p>
     <w:p>
@@ -8496,14 +8374,14 @@
           <w:sz w:val="20"/>
           <w:szCs w:val="20"/>
         </w:rPr>
-        <w:t>Primer service.</w:t>
-      </w:r>
-      <w:r>
-        <w:rPr>
-          <w:sz w:val="20"/>
-          <w:szCs w:val="20"/>
-        </w:rPr>
-        <w:t xml:space="preserve"> De los compradores de 2024, el 64,5 % hizo el primer mantenimiento en un concesionario oficial dentro de 12 meses y el 80,9 % dentro de 18; el 19 % no volvió. A 12 meses, el churn del primer service (36 %) supera al del segundo (25 %). A igual edad del vehículo, el número de services acumulados separa retornos del 40 % y del 80 %: la intensidad de la relación es un predictor de primer orden.</w:t>
+        <w:t xml:space="preserve">Primer service.</w:t>
+      </w:r>
+      <w:r>
+        <w:rPr>
+          <w:sz w:val="20"/>
+          <w:szCs w:val="20"/>
+        </w:rPr>
+        <w:t xml:space="preserve"> De los compradores de 2024, el 64,5 % hizo el primer mantenimiento en un concesionario oficial dentro de los 12 meses y el 80,9 % dentro de los 18; el 19 % no volvió. A 12 meses, el churn del primer service (36 %) es mayor que el del segundo (25 %). Con vehículos de la misma edad, la cantidad de services acumulados separa tasas de retorno del 40 % y del 80 %, así que la intensidad de la relación es uno de los predictores más fuertes.</w:t>
       </w:r>
     </w:p>
     <w:p>
@@ -8524,14 +8402,14 @@
           <w:sz w:val="20"/>
           <w:szCs w:val="20"/>
         </w:rPr>
-        <w:t>Edad del vehículo.</w:t>
-      </w:r>
-      <w:r>
-        <w:rPr>
-          <w:sz w:val="20"/>
-          <w:szCs w:val="20"/>
-        </w:rPr>
-        <w:t xml:space="preserve"> La retención anual baja de 66 % en el tercer año a 53 % en el quinto y 38 % en el sexto, cuando la mediana del parque supera los 100.000 km (Figura 5).</w:t>
+        <w:t xml:space="preserve">Edad del vehículo.</w:t>
+      </w:r>
+      <w:r>
+        <w:rPr>
+          <w:sz w:val="20"/>
+          <w:szCs w:val="20"/>
+        </w:rPr>
+        <w:t xml:space="preserve"> La retención anual pasa de 66 % en el tercer año a 53 % en el quinto y 38 % en el sexto, cuando la mediana del parque ya supera los 100.000 km (Figura 5).</w:t>
       </w:r>
     </w:p>
     <w:p>
@@ -8552,14 +8430,14 @@
           <w:sz w:val="20"/>
           <w:szCs w:val="20"/>
         </w:rPr>
-        <w:t>Columnas foto.</w:t>
-      </w:r>
-      <w:r>
-        <w:rPr>
-          <w:sz w:val="20"/>
-          <w:szCs w:val="20"/>
-        </w:rPr>
-        <w:t xml:space="preserve"> KM es idéntico en todos los turnos de un vehículo (99,99 % de los casos) e igual al último odómetro cargado. ConnectedStatusARG tampoco varía en el tiempo, y "Sin información de conectividad" marca vehículos que ya salieron del sistema. El km real de cada visita es VehicleCurrentKM.</w:t>
+        <w:t xml:space="preserve">Columnas foto.</w:t>
+      </w:r>
+      <w:r>
+        <w:rPr>
+          <w:sz w:val="20"/>
+          <w:szCs w:val="20"/>
+        </w:rPr>
+        <w:t xml:space="preserve"> KM tiene el mismo valor en todos los turnos de un vehículo (99,99 % de los casos) y coincide con el último odómetro cargado. ConnectedStatusARG tampoco cambia en el tiempo, y "Sin información de conectividad" identifica vehículos que ya salieron del sistema. El kilometraje real de cada visita está en VehicleCurrentKM.</w:t>
       </w:r>
     </w:p>
     <w:p>
@@ -8580,28 +8458,14 @@
           <w:sz w:val="20"/>
           <w:szCs w:val="20"/>
         </w:rPr>
-        <w:t>Lo que engaña en crudo.</w:t>
-      </w:r>
-      <w:r>
-        <w:rPr>
-          <w:sz w:val="20"/>
-          <w:szCs w:val="20"/>
-        </w:rPr>
-        <w:t xml:space="preserve"> Los no-shows</w:t>
-      </w:r>
-      <w:r>
-        <w:rPr>
-          <w:sz w:val="20"/>
-          <w:szCs w:val="20"/>
-        </w:rPr>
-        <w:t xml:space="preserve"> previos parecen no separar nada (78,0 % / 78,9 % / 79,1 % de retorno con 0 / 1 / 2 o más), pero es una paradoja de Simpson: quien tuvo un no-show tuvo turnos, y tener turnos es el predictor más fuerte. A igual cantidad de turnos previos, un no-show baja el retorno (67 % vs 73 % con un turno; 73 % vs 77 % con dos) y en un modelo conjunto pesa con un odds ratio de 0,7; las cancelaciones duras, parecido; las reprogramaciones se re-agendan en el 72 % de los casos a los 6 días. Un vehículo con reparaciones o </w:t>
-      </w:r>
-      <w:r>
-        <w:rPr>
-          <w:sz w:val="20"/>
-          <w:szCs w:val="20"/>
-        </w:rPr>
-        <w:t>recalls previos vuelve más, pero porque tuvo más contactos con el concesionario, no por el problema en sí. La encuesta de estrellas es previa al turno, no posterior al service, y no aporta.</w:t>
+        <w:t xml:space="preserve">Lo que engaña si se mira en crudo.</w:t>
+      </w:r>
+      <w:r>
+        <w:rPr>
+          <w:sz w:val="20"/>
+          <w:szCs w:val="20"/>
+        </w:rPr>
+        <w:t xml:space="preserve"> Los no-shows previos parecen no diferenciar a nadie (78,0 %, 78,9 % y 79,1 % de retorno con 0, 1 y 2 o más). Es una paradoja de Simpson: para faltar a un turno hay que haberlo pedido, y tener turnos es el predictor más fuerte. Comparando clientes con la misma cantidad de turnos previos, un no-show sí baja el retorno (67 % contra 73 % con un turno; 73 % contra 77 % con dos), y en un modelo conjunto pesa con un odds ratio de 0,7. Las cancelaciones duras se comportan parecido, y las reprogramaciones se vuelven a agendar en el 72 % de los casos, a los 6 días. Un vehículo con reparaciones o recalls previos vuelve más, pero por haber tenido más contacto con el concesionario y no por el problema en sí. La encuesta de estrellas se responde antes del turno, no después del service, y no aporta.</w:t>
       </w:r>
     </w:p>
     <w:p>
@@ -8622,14 +8486,14 @@
           <w:sz w:val="20"/>
           <w:szCs w:val="20"/>
         </w:rPr>
-        <w:t>Lo que sí separa.</w:t>
-      </w:r>
-      <w:r>
-        <w:rPr>
-          <w:sz w:val="20"/>
-          <w:szCs w:val="20"/>
-        </w:rPr>
-        <w:t xml:space="preserve"> La recencia (turno previo hace más de un año: 51 % de retorno; hace 1 a 3 meses: 86 %), FordPass (+3 a +5 puntos dentro de cada generación, que sobreviven al ajuste por concesionario e intensidad) y el concesionario (estable entre años; 73 % vs 84 % de retorno entre el peor y el mejor quintil).</w:t>
+        <w:t xml:space="preserve">Lo que sí separa.</w:t>
+      </w:r>
+      <w:r>
+        <w:rPr>
+          <w:sz w:val="20"/>
+          <w:szCs w:val="20"/>
+        </w:rPr>
+        <w:t xml:space="preserve"> La recencia (turno previo hace más de un año: 51 % de retorno; hace 1 a 3 meses: 86 %), FordPass (entre 3 y 5 puntos más dentro de cada generación, una diferencia que se mantiene al controlar por concesionario e intensidad) y el concesionario (estable entre años; 73 % contra 84 % de retorno entre el peor y el mejor quintil).</w:t>
       </w:r>
     </w:p>
     <w:p>
@@ -8650,15 +8514,14 @@
           <w:sz w:val="20"/>
           <w:szCs w:val="20"/>
         </w:rPr>
-        <w:lastRenderedPageBreak/>
-        <w:t>Identidad del cliente.</w:t>
-      </w:r>
-      <w:r>
-        <w:rPr>
-          <w:sz w:val="20"/>
-          <w:szCs w:val="20"/>
-        </w:rPr>
-        <w:t xml:space="preserve"> El 21 % de los vehículos tiene más de un customer_id, y la mitad de esos cambios coincide con un cambio de canal de reserva (Dealer ↔ FordPass), no con una transferencia. Que quien lleva el vehículo sea o no el comprador no cambia el retorno. Las flotas entran menos (62 % vs 80 % hacen el primer service en 15 meses) pero, una vez adentro, vuelven igual.</w:t>
+        <w:t xml:space="preserve">Identidad del cliente.</w:t>
+      </w:r>
+      <w:r>
+        <w:rPr>
+          <w:sz w:val="20"/>
+          <w:szCs w:val="20"/>
+        </w:rPr>
+        <w:t xml:space="preserve"> El 21 % de los vehículos tiene más de un customer_id, y en la mitad de los casos el cambio coincide con un cambio de canal de reserva (Dealer ↔ FordPass), no con una transferencia. Que el vehículo lo lleve el comprador u otra persona no cambia el retorno. Las flotas entran menos (62 % contra 80 % hace el primer service en 15 meses), pero una vez que entran vuelven igual.</w:t>
       </w:r>
     </w:p>
     <w:p>
@@ -9591,7 +9454,7 @@
           <w:sz w:val="20"/>
           <w:szCs w:val="20"/>
         </w:rPr>
-        <w:t>Alternativas descartadas, con números</w:t>
+        <w:t xml:space="preserve">Alternativas descartadas</w:t>
       </w:r>
       <w:r>
         <w:rPr>
@@ -9600,7 +9463,7 @@
           <w:sz w:val="20"/>
           <w:szCs w:val="20"/>
         </w:rPr>
-        <w:t xml:space="preserve"> (36 combinaciones de parámetros probadas):</w:t>
+        <w:t xml:space="preserve"> (probamos 36 combinaciones de parámetros):</w:t>
       </w:r>
     </w:p>
     <w:p>
@@ -9619,7 +9482,7 @@
           <w:sz w:val="20"/>
           <w:szCs w:val="20"/>
         </w:rPr>
-        <w:t>Regla de "un año": 66.589 ventanas, 58 % de churn, y sólo el 18 % de los retornos caen dentro de la ventana; el 86 % de los clientes ya vino antes de que abra.</w:t>
+        <w:t xml:space="preserve">Regla de "un año": 66.589 ventanas, 58 % de churn y sólo el 18 % de los retornos dentro de la ventana; el 86 % de los clientes ya había vuelto antes de que abriera.</w:t>
       </w:r>
     </w:p>
     <w:p>
@@ -9657,7 +9520,7 @@
           <w:sz w:val="20"/>
           <w:szCs w:val="20"/>
         </w:rPr>
-        <w:t>Un único K para todo el parque: con 16.000 km la P375 vence un mes tarde (más de la mitad ya volvió al abrir); con 10.000 km la P703 vence antes de tiempo.</w:t>
+        <w:t xml:space="preserve">Un único K para todo el parque: con 16.000 km la P375 vence un mes tarde (más de la mitad ya volvió cuando abre la ventana); con 10.000 km la P703 vence antes de tiempo.</w:t>
       </w:r>
     </w:p>
     <w:p>
@@ -9676,7 +9539,7 @@
           <w:sz w:val="20"/>
           <w:szCs w:val="20"/>
         </w:rPr>
-        <w:t>Apertura a −60 días: captura más retornos (64 % vs 53 %) a costa de una ventana de 150 días. Queda como alternativa si los concesionarios contactan con más anticipación.</w:t>
+        <w:t xml:space="preserve">Apertura a −60 días: captura más retornos (64 % contra 53 %), pero la ventana pasa a durar 150 días. Queda como opción si los concesionarios quieren contactar con más anticipación.</w:t>
       </w:r>
     </w:p>
     <w:p>
@@ -9695,15 +9558,7 @@
           <w:sz w:val="20"/>
           <w:szCs w:val="20"/>
         </w:rPr>
-        <w:t xml:space="preserve">Horizonte de +60 días: etiqueta como churn a muchos que vuelven tarde (47 % de churn). </w:t>
-      </w:r>
-      <w:r>
-        <w:rPr>
-          <w:sz w:val="20"/>
-          <w:szCs w:val="20"/>
-        </w:rPr>
-        <w:lastRenderedPageBreak/>
-        <w:t>Horizonte de +180 días: el resultado llega siete meses después, tarde para medir.</w:t>
+        <w:t xml:space="preserve">Horizonte de +60 días: cuenta como churn a muchos que vuelven tarde (47 % de churn). Horizonte de +180 días: el resultado se conoce siete meses después, demasiado tarde para medir.</w:t>
       </w:r>
     </w:p>
     <w:p>
@@ -9722,7 +9577,7 @@
           <w:sz w:val="20"/>
           <w:szCs w:val="20"/>
         </w:rPr>
-        <w:t>Contraste con una solución independiente.</w:t>
+        <w:t xml:space="preserve">Contraste con una solución independiente.</w:t>
       </w:r>
       <w:r>
         <w:rPr>
@@ -9731,16 +9586,7 @@
           <w:sz w:val="20"/>
           <w:szCs w:val="20"/>
         </w:rPr>
-        <w:t xml:space="preserve"> Un segundo equipo de análisis resolvió el mismo desafío sin ver este trabajo y llegó a la misma población y al mismo evento, pero con un horizonte de un mes calendario, lo que da 78 % de churn. Aplicando cada etiqueta sobre las ventanas del otro se demostró que la diferencia es sólo el horizonte (79,0 % vs 44,0 %) y que entre el 40 % y el 44 % de los "churn</w:t>
-      </w:r>
-      <w:r>
-        <w:rPr>
-          <w:i w:val="0"/>
-          <w:iCs w:val="0"/>
-          <w:sz w:val="20"/>
-          <w:szCs w:val="20"/>
-        </w:rPr>
-        <w:t>" mensuales completan el mantenimiento antes de vencimiento + 90 días. Adoptamos el horizonte de 90 días como resultado primario, la cadencia mensual de scoring como operación, y dejamos al negocio la validación final de ambos parámetros.</w:t>
+        <w:t xml:space="preserve"> Un segundo equipo de análisis resolvió el mismo desafío sin ver este trabajo. Llegó a la misma población y al mismo evento, pero con un horizonte de un mes calendario, y por eso obtuvo un 78 % de churn. Al aplicar cada etiqueta sobre las ventanas de la otra solución quedó claro que la diferencia era sólo el horizonte (79,0 % contra 44,0 %) y que entre el 40 % y el 44 % de los "churn" mensuales completan el mantenimiento antes de vencimiento + 90 días. Tomamos el horizonte de 90 días como resultado principal y el scoring mensual como cadencia operativa; la validación final de ambos parámetros le corresponde al negocio.</w:t>
       </w:r>
     </w:p>
     <w:p>
@@ -9770,7 +9616,7 @@
           <w:sz w:val="20"/>
           <w:szCs w:val="20"/>
         </w:rPr>
-        <w:t>Uniones temporales.</w:t>
+        <w:t xml:space="preserve">Uniones temporales.</w:t>
       </w:r>
       <w:r>
         <w:rPr>
@@ -9779,7 +9625,7 @@
           <w:sz w:val="20"/>
           <w:szCs w:val="20"/>
         </w:rPr>
-        <w:t xml:space="preserve"> Las features se calculan con acumulados por vehículo y merge_asof hacia atrás sin coincidencia exacta: para una ventana con fecha de scoring t sólo entran turnos anteriores a t y encuestas respondidas antes de t.</w:t>
+        <w:t xml:space="preserve"> Las features se calculan con acumulados por vehículo y merge_asof hacia atrás sin coincidencia exacta. Para una ventana con fecha de scoring t sólo entran turnos anteriores a t y encuestas respondidas antes de t.</w:t>
       </w:r>
     </w:p>
     <w:p>
@@ -9798,7 +9644,7 @@
           <w:sz w:val="20"/>
           <w:szCs w:val="20"/>
         </w:rPr>
-        <w:t>Las 86 features, en nueve grupos:</w:t>
+        <w:t xml:space="preserve">Las 86 features, en nueve grupos:</w:t>
       </w:r>
       <w:r>
         <w:rPr>
@@ -9807,16 +9653,7 @@
           <w:sz w:val="20"/>
           <w:szCs w:val="20"/>
         </w:rPr>
-        <w:t xml:space="preserve"> recencia (días desde el último mantenimiento, turno y visita); frecuencia e intensidad (mantenimientos por año observado, visitas, diagnósticos, reparaciones, recalls); patrón de uso (km/año, atraso en km respecto del plan, services salteados); ciclo de vida (antigüedad, n° de service, generación, versión); canal (último canal, proporción FordPass</w:t>
-      </w:r>
-      <w:r>
-        <w:rPr>
-          <w:i w:val="0"/>
-          <w:iCs w:val="0"/>
-          <w:sz w:val="20"/>
-          <w:szCs w:val="20"/>
-        </w:rPr>
-        <w:t>); concesionario (concesionario y zona del último mantenimiento, cambios de dealer); relación (tamaño de flota, vehículos del cliente, cambios de cliente); venta (unidad de negocio, tipo de persona, canal, provincia); y geometría de la ventana (qué regla vence primero, días al vencimiento).</w:t>
+        <w:t xml:space="preserve"> recencia (días desde el último mantenimiento, turno y visita); frecuencia e intensidad (mantenimientos por año observado, visitas, diagnósticos, reparaciones, recalls); patrón de uso (km/año, atraso en km respecto del plan, services salteados); ciclo de vida (antigüedad, n° de service, generación, versión); canal (último canal, proporción FordPass); concesionario (concesionario y zona del último mantenimiento, cambios de dealer); relación (tamaño de flota, vehículos del cliente, cambios de cliente); venta (unidad de negocio, tipo de persona, canal, provincia), y geometría de la ventana (qué regla vence primero, días al vencimiento).</w:t>
       </w:r>
     </w:p>
     <w:p>
@@ -9835,7 +9672,7 @@
           <w:sz w:val="20"/>
           <w:szCs w:val="20"/>
         </w:rPr>
-        <w:t>Historia invisible.</w:t>
+        <w:t xml:space="preserve">Historia invisible.</w:t>
       </w:r>
       <w:r>
         <w:rPr>
@@ -9844,16 +9681,7 @@
           <w:sz w:val="20"/>
           <w:szCs w:val="20"/>
         </w:rPr>
-        <w:t xml:space="preserve"> El 60 % del parque tiene garantía anterior al inicio de la agenda, así que su historia previa a 2024 no se ve. Se mitiga con la antigüedad, el n° de service y "meses de historia observable" como </w:t>
-      </w:r>
-      <w:r>
-        <w:rPr>
-          <w:i w:val="0"/>
-          <w:iCs w:val="0"/>
-          <w:sz w:val="20"/>
-          <w:szCs w:val="20"/>
-        </w:rPr>
-        <w:t>features.</w:t>
+        <w:t xml:space="preserve"> El 60 % del parque tiene garantía anterior al inicio de la agenda, así que no vemos su historia previa a 2024. Lo compensamos con la antigüedad, el n° de service y los "meses de historia observable" como features.</w:t>
       </w:r>
     </w:p>
     <w:p>
@@ -9872,7 +9700,7 @@
           <w:sz w:val="20"/>
           <w:szCs w:val="20"/>
         </w:rPr>
-        <w:t>Partición temporal.</w:t>
+        <w:t xml:space="preserve">Partición temporal.</w:t>
       </w:r>
       <w:r>
         <w:rPr>
@@ -9893,13 +9721,22 @@
       </w:pPr>
       <w:r>
         <w:rPr>
-          <w:bCs/>
+          <w:b/>
           <w:i w:val="0"/>
           <w:iCs w:val="0"/>
           <w:sz w:val="20"/>
           <w:szCs w:val="20"/>
         </w:rPr>
-        <w:t>Por qué no validación cruzada aleatoria. Mezclaría ventanas del mismo vehículo y ocultaría el cambio de composición del parque: la P375 cae de 5.856 a 2.009 mantenimientos mensuales mientras la P703 sube de 437 a 5.625. La partición actual usa scoring_date, no el cierre de cada etiqueta. Hay horizontes que cruzan los cortes, sin purga ni embargo; el dashboard cuantifica esos cruces. La evaluación por ventanas tampoco prueba generalización a clientes nunca observados.</w:t>
+        <w:t xml:space="preserve">Por qué no validación cruzada aleatoria.</w:t>
+      </w:r>
+      <w:r>
+        <w:rPr>
+          <w:i w:val="0"/>
+          <w:iCs w:val="0"/>
+          <w:sz w:val="20"/>
+          <w:szCs w:val="20"/>
+        </w:rPr>
+        <w:t xml:space="preserve"> Mezclaría ventanas de un mismo vehículo y taparía el cambio en la composición del parque: la P375 baja de 5.856 a 2.009 mantenimientos por mes mientras la P703 sube de 437 a 5.625. La partición usa scoring_date y no la fecha de cierre de cada etiqueta, así que hay horizontes que cruzan los cortes sin purga ni embargo; el dashboard muestra cuántos son. Esta evaluación por ventanas tampoco prueba que el modelo generalice a clientes que nunca aparecieron en los datos.</w:t>
       </w:r>
     </w:p>
     <w:p>
@@ -9918,7 +9755,7 @@
           <w:sz w:val="20"/>
           <w:szCs w:val="20"/>
         </w:rPr>
-        <w:t>Baselines.</w:t>
+        <w:t xml:space="preserve">Baselines.</w:t>
       </w:r>
       <w:r>
         <w:rPr>
@@ -9927,7 +9764,7 @@
           <w:sz w:val="20"/>
           <w:szCs w:val="20"/>
         </w:rPr>
-        <w:t xml:space="preserve"> Azar (equivalente a la prioridad uniforme actual), una heurística de reglas (antigüedad + no-shows) y una regresión logística con 24 features. El modelo principal es LightGBM (gradient boosting) con categóricas nativas, early stopping y calibración isotónica.</w:t>
+        <w:t xml:space="preserve"> Azar (equivale a la priorización uniforme de hoy), una heurística de reglas (antigüedad + no-shows) y una regresión logística con 24 features. El modelo principal es un LightGBM (gradient boosting) con categóricas nativas, early stopping y calibración isotónica.</w:t>
       </w:r>
     </w:p>
     <w:p>
@@ -9957,17 +9794,16 @@
           <w:sz w:val="20"/>
           <w:szCs w:val="20"/>
         </w:rPr>
-        <w:t>Métricas de la primera etapa, fuera de tiempo (test:</w:t>
-      </w:r>
-      <w:r>
-        <w:rPr>
-          <w:bCs/>
+        <w:t xml:space="preserve">Métricas de la primera etapa, fuera de tiempo</w:t>
+      </w:r>
+      <w:r>
+        <w:rPr>
           <w:i w:val="0"/>
           <w:iCs w:val="0"/>
           <w:sz w:val="20"/>
           <w:szCs w:val="20"/>
         </w:rPr>
-        <w:t xml:space="preserve"> 19.709 ventanas, churn 42,6 %). No evalúan la segunda etapa de priorización operativa ni el efecto causal del contacto:</w:t>
+        <w:t xml:space="preserve"> (test: 19.709 ventanas, churn 42,6 %). Evalúan el ranking de riesgo, no la segunda etapa ni el efecto del contacto:</w:t>
       </w:r>
     </w:p>
     <w:p>
@@ -9980,13 +9816,22 @@
       </w:pPr>
       <w:r>
         <w:rPr>
-          <w:bCs/>
+          <w:b/>
           <w:i w:val="0"/>
           <w:iCs w:val="0"/>
           <w:sz w:val="20"/>
           <w:szCs w:val="20"/>
         </w:rPr>
-        <w:t>Cómo leer las métricas. ROC-AUC evalúa el orden del riesgo entre casos con y sin abandono; 0,5 equivale a un ranking sin discriminación. PR-AUC corresponde aquí a average precision (AP), que resume precisión y recall para la clase abandono. En ambas, un valor mayor es mejor, considerando la tasa de abandono de la muestra.</w:t>
+        <w:t xml:space="preserve">Cómo leer las métricas.</w:t>
+      </w:r>
+      <w:r>
+        <w:rPr>
+          <w:i w:val="0"/>
+          <w:iCs w:val="0"/>
+          <w:sz w:val="20"/>
+          <w:szCs w:val="20"/>
+        </w:rPr>
+        <w:t xml:space="preserve"> ROC-AUC mide qué tan bien el modelo ordena a quienes abandonan por encima de quienes no; 0,5 equivale a ordenar al azar. PR-AUC es acá la average precision (AP), que combina precisión y recall para la clase abandono. En las dos, más alto es mejor, siempre teniendo en cuenta la tasa de abandono de la muestra.</w:t>
       </w:r>
     </w:p>
     <w:p>
@@ -9998,24 +9843,12 @@
       </w:pPr>
       <w:r>
         <w:rPr>
-          <w:bCs/>
           <w:i w:val="0"/>
           <w:iCs w:val="0"/>
           <w:sz w:val="20"/>
           <w:szCs w:val="20"/>
         </w:rPr>
-        <w:t xml:space="preserve">Brier es el error cuadrático medio de las probabilidades; log loss penaliza especialmente las </w:t>
-      </w:r>
-      <w:r>
-        <w:rPr>
-          <w:bCs/>
-          <w:i w:val="0"/>
-          <w:iCs w:val="0"/>
-          <w:sz w:val="20"/>
-          <w:szCs w:val="20"/>
-        </w:rPr>
-        <w:lastRenderedPageBreak/>
-        <w:t>predicciones erróneas muy seguras; ECE resume la distancia entre probabilidad estimada y frecuencia observada por intervalos. En estas tres métricas, menor es mejor. n indica ventanas evaluadas y base_rate la proporción que abandonó. Ninguna de estas medidas estima el efecto incremental del contacto ni valida por sí sola la segunda etapa.</w:t>
+        <w:t xml:space="preserve">Brier es el error cuadrático medio de las probabilidades, log loss castiga sobre todo los errores cometidos con mucha seguridad y ECE resume la distancia entre la probabilidad estimada y la frecuencia observada por intervalos. En estas tres, más bajo es mejor. n es la cantidad de ventanas evaluadas y base_rate, la proporción que abandonó.</w:t>
       </w:r>
     </w:p>
     <w:tbl>
@@ -10742,7 +10575,7 @@
           <w:sz w:val="20"/>
           <w:szCs w:val="20"/>
         </w:rPr>
-        <w:t>Recall a capacidad de contacto.</w:t>
+        <w:t xml:space="preserve">Recall a capacidad de contacto.</w:t>
       </w:r>
       <w:r>
         <w:rPr>
@@ -10751,7 +10584,7 @@
           <w:sz w:val="20"/>
           <w:szCs w:val="20"/>
         </w:rPr>
-        <w:t xml:space="preserve"> Si los concesionarios pueden contactar al X % de la población en ventana, ¿a qué fracción de los que se van alcanzan?</w:t>
+        <w:t xml:space="preserve"> Si los concesionarios pueden contactar al X % de la población en ventana, ¿a qué parte de los que se van llegan?</w:t>
       </w:r>
     </w:p>
     <w:tbl>
@@ -11763,7 +11596,7 @@
           <w:sz w:val="20"/>
           <w:szCs w:val="20"/>
         </w:rPr>
-        <w:t>Con una capacidad absoluta de 3.000 contactos por mes entre todos los concesionarios, el modelo alcanza al 65 % de los que se van, con una precisión del 61 %.</w:t>
+        <w:t xml:space="preserve">Con una capacidad fija de 3.000 contactos por mes entre todos los concesionarios, el modelo llega al 65 % de los que se van, con una precisión del 61 %.</w:t>
       </w:r>
     </w:p>
     <w:p>
@@ -13948,7 +13781,14 @@
         <w:jc w:val="both"/>
       </w:pPr>
       <w:r>
-        <w:t>Acciones comerciales propuestas. En Alto y Medio se aplican a los clientes seleccionados por la segunda etapa; las tasas de churn describen los segmentos del modelo original.</w:t>
+        <w:rPr>
+          <w:b/>
+        </w:rPr>
+        <w:t xml:space="preserve">Acciones comerciales propuestas.</w:t>
+      </w:r>
+      <w:r>
+        <w:rPr/>
+        <w:t xml:space="preserve"> En Alto y Medio se aplican a los clientes que selecciona la segunda etapa. Las tasas de churn son las de cada segmento del modelo original.</w:t>
       </w:r>
     </w:p>
     <w:p>
@@ -13967,17 +13807,16 @@
           <w:sz w:val="20"/>
           <w:szCs w:val="20"/>
         </w:rPr>
-        <w:t>Población al corte del 25/08/2026:</w:t>
-      </w:r>
-      <w:r>
-        <w:rPr>
-          <w:bCs/>
+        <w:t xml:space="preserve">Población al corte del 25/08/2026:</w:t>
+      </w:r>
+      <w:r>
+        <w:rPr>
           <w:i w:val="0"/>
           <w:iCs w:val="0"/>
           <w:sz w:val="20"/>
           <w:szCs w:val="20"/>
         </w:rPr>
-        <w:t xml:space="preserve"> 30.504 vehículos, 22.255 en ventana y 8.249 que entran en los próximos 30 días. Alto: 6.100; Medio: 9.152; Bajo: 15.252. La segunda etapa recibe los 15.252 vehículos de Alto y Medio, que reúnen 13.049 customer_id conocidos; los registros sin identificación permanecen en la auditoría. La lista se consolida por cliente después de evaluar cada vehículo. Los turnos agendados y las demás restricciones se aplican sólo al seleccionar la oportunidad de contacto, sin borrar el scoring original.</w:t>
+        <w:t xml:space="preserve"> 30.504 vehículos, 22.255 en ventana y 8.249 que entran en los próximos 30 días. Alto: 6.100; Medio: 9.152; Bajo: 15.252. A la segunda etapa pasan los 15.252 vehículos de Alto y Medio, que corresponden a 13.049 customer_id conocidos; los registros sin identificar quedan en la auditoría. La consolidación por cliente se hace después de evaluar cada vehículo, y los turnos agendados y demás restricciones sólo se aplican al elegir a quién contactar, sin modificar el scoring original.</w:t>
       </w:r>
     </w:p>
     <w:p>
@@ -13994,7 +13833,7 @@
           <w:sz w:val="20"/>
           <w:szCs w:val="20"/>
         </w:rPr>
-        <w:t>Con la política predeterminada, esa corrida produce 7.966 clientes habilitados: 3.000 seleccionados y 4.966 en espera. Otros 2.584 quedan en Revisar, 2.096 en Sin margen y 403 en Con turno. Los 93 vehículos sin customer_id quedan sólo en la auditoría. Son cantidades operativas del corte, no resultados de una campaña ni una medición de retención; cambian al cargar otro dataset o ajustar la política.</w:t>
+        <w:t xml:space="preserve">Con la política por defecto, esa corrida deja 7.966 clientes habilitados: 3.000 seleccionados y 4.966 en espera. Otros 2.584 quedan en Revisar, 2.096 en Sin margen y 403 en Con turno, y los 93 vehículos sin customer_id quedan sólo en la auditoría. Son cantidades operativas de ese corte, no resultados de una campaña, y cambian si se carga otro dataset o se ajusta la política.</w:t>
       </w:r>
     </w:p>
     <w:p>
@@ -14072,14 +13911,12 @@
       </w:pPr>
       <w:r>
         <w:rPr>
-          <w:b/>
-          <w:bCs/>
           <w:i w:val="0"/>
           <w:iCs w:val="0"/>
           <w:sz w:val="20"/>
           <w:szCs w:val="20"/>
         </w:rPr>
-        <w:t>Output del scoring y de la segunda etapa (formato de integración):</w:t>
+        <w:t xml:space="preserve">Salida del scoring y de la segunda etapa (formato de integración):</w:t>
       </w:r>
     </w:p>
     <w:tbl>
@@ -14690,16 +14527,7 @@
           <w:sz w:val="20"/>
           <w:szCs w:val="20"/>
         </w:rPr>
-        <w:t>El customer_id persiste entre ventas y entre ventas y agenda, así que el dataset permite observar recompra Ranger→Ranger</w:t>
-      </w:r>
-      <w:r>
-        <w:rPr>
-          <w:i w:val="0"/>
-          <w:iCs w:val="0"/>
-          <w:sz w:val="20"/>
-          <w:szCs w:val="20"/>
-        </w:rPr>
-        <w:t>. 12.239 ventas de 2024-26 (20,6 %) son de compradores que ya usaban otra Ranger, entregada al menos un año antes y vista en la agenda antes de comprar (6.192 compradores, 4.389 personas físicas). De 33.391 dueños de Ranger anteriores a 2024 vistos en la agenda en el primer semestre de 2024, el 6,4 % compró una Ranger 0 km dentro de los 12 meses siguientes y el 11,2 % dentro de los 24. Con esos positivos se puede entrenar un segundo modelo, complementario, que mida el vínculo entre service y recompra.</w:t>
+        <w:t xml:space="preserve">El customer_id se mantiene entre ventas y entre ventas y agenda, así que en el dataset se puede ver la recompra Ranger→Ranger. 12.239 ventas de 2024-26 (20,6 %) son de compradores que ya usaban otra Ranger, entregada al menos un año antes y registrada en la agenda antes de la compra (6.192 compradores, 4.389 personas físicas). De los 33.391 dueños de Ranger anteriores a 2024 que aparecen en la agenda en el primer semestre de 2024, el 6,4 % compró una Ranger 0 km en los 12 meses siguientes y el 11,2 % en los 24. Con esos casos positivos se puede entrenar un segundo modelo, complementario, que mida la relación entre service y recompra.</w:t>
       </w:r>
     </w:p>
     <w:p>
@@ -14729,7 +14557,7 @@
           <w:sz w:val="20"/>
           <w:szCs w:val="20"/>
         </w:rPr>
-        <w:t>Supuestos declarados y editables de la simulación de la primera etapa: recuperación por contacto del 15 % de quienes abandonarían, valor de un service retenido de USD 250 y costo de contacto personal de USD 3. No son efectos estimados a partir de campañas observadas. La segunda etapa de contacto no tiene todavía métricas de retención incremental; éstas requieren un piloto con control.</w:t>
+        <w:t xml:space="preserve">Supuestos de la simulación de la primera etapa, declarados y editables: un contacto recupera al 15 % de quienes iban a abandonar, un service retenido vale USD 250 y un contacto personal cuesta USD 3. No salen de campañas observadas. La segunda etapa todavía no tiene métricas de retención incremental; para eso hace falta un piloto con grupo de control.</w:t>
       </w:r>
     </w:p>
     <w:tbl>
@@ -15454,7 +15282,7 @@
           <w:sz w:val="20"/>
           <w:szCs w:val="20"/>
         </w:rPr>
-        <w:t>Bajo esos supuestos, sobre las 19.709 ventanas de los tres meses de test, contactar al 20 % según riesgo en lugar de al azar estima unos USD 52.000 de margen incremental; anualizado, del orden de USD 200.000. Estas cifras no deben atribuirse al segundo filtro ni interpretarse como ingresos ya obtenidos.</w:t>
+        <w:t xml:space="preserve">Con esos supuestos, sobre las 19.709 ventanas de los tres meses de test, contactar al 20 % de mayor riesgo en lugar de elegir al azar da unos USD 52.000 de margen incremental, del orden de USD 200.000 al año. No son ingresos obtenidos ni deben atribuirse a la segunda etapa.</w:t>
       </w:r>
     </w:p>
     <w:p>
@@ -15607,16 +15435,7 @@
           <w:sz w:val="20"/>
           <w:szCs w:val="20"/>
         </w:rPr>
-        <w:t xml:space="preserve">Repositorio del equipo, carpeta desafio-1-repurchase-propensity/: src/repurchase/ contiene carga, eventos, ventanas, features, modelo, evaluación, explicabilidad, negocio y contacto. scripts/run_pipeline.py ejecuta la secuencia completa y scripts/run_contacto.py repite la política sobre scores existentes. config/params.json define la ventana, config/negocio.json los supuestos económicos y config/contacto.json el segundo paso. webapp/abrir_app.bat inicia la aplicación en Windows; abrir_demo.bat delega en el </w:t>
-      </w:r>
-      <w:r>
-        <w:rPr>
-          <w:i w:val="0"/>
-          <w:iCs w:val="0"/>
-          <w:sz w:val="20"/>
-          <w:szCs w:val="20"/>
-        </w:rPr>
-        <w:t>mismo lanzador por compatibilidad. scripts/eda/, scripts/sensibilidad_ventana.py, scripts/ablaciones.py y notebooks/ conservan la evidencia técnica. Entorno: Python 3.12, pandas, scikit-learn, LightGBM, SHAP y Streamlit. Los CSV de origen se mantienen sin modificaciones.</w:t>
+        <w:t xml:space="preserve">Repositorio del equipo, carpeta desafio-1-repurchase-propensity/. En src/repurchase/ están la carga, los eventos, las ventanas, las features, el modelo, la evaluación, la explicabilidad, el negocio y el contacto. scripts/run_pipeline.py corre toda la secuencia y scripts/run_contacto.py repite la política sobre scores ya calculados. config/params.json define la ventana, config/negocio.json los supuestos económicos y config/contacto.json la segunda etapa. La aplicación se abre con webapp/abrir_app.bat en Windows o webapp/abrir_app.sh en Linux y macOS. scripts/eda/, scripts/sensibilidad_ventana.py, scripts/ablaciones.py y notebooks/ guardan la evidencia técnica. Entorno: Python 3.12, pandas, scikit-learn, LightGBM, SHAP y Streamlit, con versiones fijadas en requirements-lock.txt. Los CSV de origen no se modifican.</w:t>
       </w:r>
     </w:p>
     <w:sectPr>

</xml_diff>